<commit_message>
Update AquiferOpenStudyNotesThemes for 2026-08-25
</commit_message>
<xml_diff>
--- a/arb/docx/007.content.docx
+++ b/arb/docx/007.content.docx
@@ -9,6 +9,8 @@
       </w:pPr>
       <w:r>
         <w:rPr>
+          <w:rtl/>
+          <w:cs/>
           <w:lang w:val="ar_AE" w:bidi="ar_AE"/>
         </w:rPr>
       </w:r>
@@ -20,12 +22,16 @@
       </w:pPr>
       <w:r>
         <w:rPr>
+          <w:rtl/>
+          <w:cs/>
           <w:lang w:val="ar_AE" w:bidi="ar_AE"/>
         </w:rPr>
         <w:t>Resource: Aquifer Open Study Notes (Themes)</w:t>
       </w:r>
       <w:r>
         <w:rPr>
+          <w:rtl/>
+          <w:cs/>
           <w:lang w:val="ar_AE" w:bidi="ar_AE"/>
         </w:rPr>
       </w:r>
@@ -36,12 +42,16 @@
       </w:pPr>
       <w:r>
         <w:rPr>
+          <w:rtl/>
+          <w:cs/>
           <w:lang w:val="ar_AE" w:bidi="ar_AE"/>
         </w:rPr>
       </w:r>
       <w:r>
         <w:rPr>
           <w:b/>
+          <w:rtl/>
+          <w:cs/>
           <w:lang w:val="ar_AE" w:bidi="ar_AE"/>
         </w:rPr>
         <w:t>Aquifer Open Study Notes (Themes)</w:t>
@@ -53,35 +63,47 @@
       </w:pPr>
       <w:r>
         <w:rPr>
-          <w:lang w:val="ar_AE" w:bidi="ar_AE"/>
-        </w:rPr>
-      </w:r>
-      <w:r>
-        <w:rPr>
+          <w:rtl/>
+          <w:cs/>
+          <w:lang w:val="ar_AE" w:bidi="ar_AE"/>
+        </w:rPr>
+      </w:r>
+      <w:r>
+        <w:rPr>
+          <w:rtl/>
+          <w:cs/>
           <w:lang w:val="ar_AE" w:bidi="ar_AE"/>
         </w:rPr>
         <w:t xml:space="preserve">This work is an adaptation of </w:t>
       </w:r>
       <w:r>
         <w:rPr>
+          <w:rtl/>
+          <w:cs/>
           <w:lang w:val="ar_AE" w:bidi="ar_AE"/>
         </w:rPr>
         <w:t>Tyndale Open Study Notes</w:t>
       </w:r>
       <w:r>
         <w:rPr>
+          <w:rtl/>
+          <w:cs/>
           <w:lang w:val="ar_AE" w:bidi="ar_AE"/>
         </w:rPr>
         <w:t xml:space="preserve"> © 2023 Tyndale House Publishers, licensed under the CC BY-SA 4.0 license. The adaptation, </w:t>
       </w:r>
       <w:r>
         <w:rPr>
+          <w:rtl/>
+          <w:cs/>
           <w:lang w:val="ar_AE" w:bidi="ar_AE"/>
         </w:rPr>
         <w:t>Aquifer Open Study Notes</w:t>
       </w:r>
       <w:r>
         <w:rPr>
+          <w:rtl/>
+          <w:cs/>
           <w:lang w:val="ar_AE" w:bidi="ar_AE"/>
         </w:rPr>
         <w:t>, was created by Mission Mutual and is also licensed under CC BY-SA 4.0.</w:t>
@@ -93,22 +115,30 @@
       </w:pPr>
       <w:r>
         <w:rPr>
-          <w:lang w:val="ar_AE" w:bidi="ar_AE"/>
-        </w:rPr>
-      </w:r>
-      <w:r>
-        <w:rPr>
+          <w:rtl/>
+          <w:cs/>
+          <w:lang w:val="ar_AE" w:bidi="ar_AE"/>
+        </w:rPr>
+      </w:r>
+      <w:r>
+        <w:rPr>
+          <w:rtl/>
+          <w:cs/>
           <w:lang w:val="ar_AE" w:bidi="ar_AE"/>
         </w:rPr>
         <w:t>This resource has been adapted into multiple languages, including English, Tok Pisin, Arabic (عربي), French (Français), Hindi (हिंदी), Indonesian (Bahasa Indonesia), Portuguese (Português), Russian (Русский), Spanish (Español), Swahili (Kiswahili), and Simplified Chinese (简体中文).</w:t>
       </w:r>
       <w:r>
         <w:rPr>
-          <w:lang w:val="ar_AE" w:bidi="ar_AE"/>
-        </w:rPr>
-      </w:r>
-      <w:r>
-        <w:rPr>
+          <w:rtl/>
+          <w:cs/>
+          <w:lang w:val="ar_AE" w:bidi="ar_AE"/>
+        </w:rPr>
+      </w:r>
+      <w:r>
+        <w:rPr>
+          <w:rtl/>
+          <w:cs/>
           <w:lang w:val="ar_AE" w:bidi="ar_AE"/>
         </w:rPr>
       </w:r>
@@ -120,6 +150,8 @@
       </w:pPr>
       <w:r>
         <w:rPr>
+          <w:rtl/>
+          <w:cs/>
           <w:lang w:val="ar_AE" w:bidi="ar_AE"/>
         </w:rPr>
         <w:t>Aquifer Open Study Notes (Themes)</w:t>
@@ -149,6 +181,8 @@
       </w:pPr>
       <w:r>
         <w:rPr>
+          <w:rtl/>
+          <w:cs/>
           <w:lang w:val="ar_AE" w:bidi="ar_AE"/>
         </w:rPr>
       </w:r>
@@ -160,12 +194,16 @@
       </w:pPr>
       <w:r>
         <w:rPr>
+          <w:rtl/>
+          <w:cs/>
           <w:lang w:val="ar_AE" w:bidi="ar_AE"/>
         </w:rPr>
         <w:t>د</w:t>
       </w:r>
       <w:r>
         <w:rPr>
+          <w:rtl/>
+          <w:cs/>
           <w:lang w:val="ar_AE" w:bidi="ar_AE"/>
         </w:rPr>
       </w:r>
@@ -176,22 +214,30 @@
       </w:pPr>
       <w:r>
         <w:rPr>
-          <w:lang w:val="ar_AE" w:bidi="ar_AE"/>
-        </w:rPr>
-      </w:r>
-      <w:r>
-        <w:rPr>
+          <w:rtl/>
+          <w:cs/>
+          <w:lang w:val="ar_AE" w:bidi="ar_AE"/>
+        </w:rPr>
+      </w:r>
+      <w:r>
+        <w:rPr>
+          <w:rtl/>
+          <w:cs/>
           <w:lang w:val="ar_AE" w:bidi="ar_AE"/>
         </w:rPr>
         <w:t xml:space="preserve"> </w:t>
       </w:r>
       <w:r>
         <w:rPr>
-          <w:lang w:val="ar_AE" w:bidi="ar_AE"/>
-        </w:rPr>
-      </w:r>
-      <w:r>
-        <w:rPr>
+          <w:rtl/>
+          <w:cs/>
+          <w:lang w:val="ar_AE" w:bidi="ar_AE"/>
+        </w:rPr>
+      </w:r>
+      <w:r>
+        <w:rPr>
+          <w:rtl/>
+          <w:cs/>
           <w:lang w:val="ar_AE" w:bidi="ar_AE"/>
         </w:rPr>
       </w:r>
@@ -217,6 +263,8 @@
       </w:pPr>
       <w:r>
         <w:rPr>
+          <w:rtl/>
+          <w:cs/>
           <w:lang w:val="ar_AE" w:bidi="ar_AE"/>
         </w:rPr>
       </w:r>
@@ -228,12 +276,16 @@
       </w:pPr>
       <w:r>
         <w:rPr>
+          <w:rtl/>
+          <w:cs/>
           <w:lang w:val="ar_AE" w:bidi="ar_AE"/>
         </w:rPr>
         <w:t>الديانة الكنعانية</w:t>
       </w:r>
       <w:r>
         <w:rPr>
+          <w:rtl/>
+          <w:cs/>
           <w:lang w:val="ar_AE" w:bidi="ar_AE"/>
         </w:rPr>
       </w:r>
@@ -244,11 +296,15 @@
       </w:pPr>
       <w:r>
         <w:rPr>
-          <w:lang w:val="ar_AE" w:bidi="ar_AE"/>
-        </w:rPr>
-      </w:r>
-      <w:r>
-        <w:rPr>
+          <w:rtl/>
+          <w:cs/>
+          <w:lang w:val="ar_AE" w:bidi="ar_AE"/>
+        </w:rPr>
+      </w:r>
+      <w:r>
+        <w:rPr>
+          <w:rtl/>
+          <w:cs/>
           <w:lang w:val="ar_AE" w:bidi="ar_AE"/>
         </w:rPr>
         <w:t>كان الكنعانيون يربطون الخليقة أو الطبيعة بآلهتهم. كان كل إله يمثِّل إحدى قوى الطبيعة. فقد اعتبروا القمر، والشمس، والنجوم البارزة، والكواكب المرئية آلهة أو إلهات.</w:t>
@@ -260,11 +316,15 @@
       </w:pPr>
       <w:r>
         <w:rPr>
-          <w:lang w:val="ar_AE" w:bidi="ar_AE"/>
-        </w:rPr>
-      </w:r>
-      <w:r>
-        <w:rPr>
+          <w:rtl/>
+          <w:cs/>
+          <w:lang w:val="ar_AE" w:bidi="ar_AE"/>
+        </w:rPr>
+      </w:r>
+      <w:r>
+        <w:rPr>
+          <w:rtl/>
+          <w:cs/>
           <w:lang w:val="ar_AE" w:bidi="ar_AE"/>
         </w:rPr>
         <w:t>كان للآلهة الكنعانية جانبان بارزان:</w:t>
@@ -283,11 +343,15 @@
       </w:pPr>
       <w:r>
         <w:rPr>
-          <w:lang w:val="ar_AE" w:bidi="ar_AE"/>
-        </w:rPr>
-      </w:r>
-      <w:r>
-        <w:rPr>
+          <w:rtl/>
+          <w:cs/>
+          <w:lang w:val="ar_AE" w:bidi="ar_AE"/>
+        </w:rPr>
+      </w:r>
+      <w:r>
+        <w:rPr>
+          <w:rtl/>
+          <w:cs/>
           <w:lang w:val="ar_AE" w:bidi="ar_AE"/>
         </w:rPr>
         <w:t>قد تتغير شخصياتها.</w:t>
@@ -302,11 +366,15 @@
       </w:pPr>
       <w:r>
         <w:rPr>
-          <w:lang w:val="ar_AE" w:bidi="ar_AE"/>
-        </w:rPr>
-      </w:r>
-      <w:r>
-        <w:rPr>
+          <w:rtl/>
+          <w:cs/>
+          <w:lang w:val="ar_AE" w:bidi="ar_AE"/>
+        </w:rPr>
+      </w:r>
+      <w:r>
+        <w:rPr>
+          <w:rtl/>
+          <w:cs/>
           <w:lang w:val="ar_AE" w:bidi="ar_AE"/>
         </w:rPr>
         <w:t>كانت أسماؤها مرتبطة بأدوارها.</w:t>
@@ -318,11 +386,15 @@
       </w:pPr>
       <w:r>
         <w:rPr>
-          <w:lang w:val="ar_AE" w:bidi="ar_AE"/>
-        </w:rPr>
-      </w:r>
-      <w:r>
-        <w:rPr>
+          <w:rtl/>
+          <w:cs/>
+          <w:lang w:val="ar_AE" w:bidi="ar_AE"/>
+        </w:rPr>
+      </w:r>
+      <w:r>
+        <w:rPr>
+          <w:rtl/>
+          <w:cs/>
           <w:lang w:val="ar_AE" w:bidi="ar_AE"/>
         </w:rPr>
         <w:t>كان لبعض هذه الآلهة تأثير كبير في تعاملات بني إسرائيل مع الشعب الكنعاني:</w:t>
@@ -341,11 +413,15 @@
       </w:pPr>
       <w:r>
         <w:rPr>
-          <w:lang w:val="ar_AE" w:bidi="ar_AE"/>
-        </w:rPr>
-      </w:r>
-      <w:r>
-        <w:rPr>
+          <w:rtl/>
+          <w:cs/>
+          <w:lang w:val="ar_AE" w:bidi="ar_AE"/>
+        </w:rPr>
+      </w:r>
+      <w:r>
+        <w:rPr>
+          <w:rtl/>
+          <w:cs/>
           <w:lang w:val="ar_AE" w:bidi="ar_AE"/>
         </w:rPr>
         <w:t>الاسم "إل"</w:t>
@@ -353,12 +429,16 @@
       <w:r>
         <w:rPr>
           <w:i/>
+          <w:rtl/>
+          <w:cs/>
           <w:lang w:val="ar_AE" w:bidi="ar_AE"/>
         </w:rPr>
         <w:t xml:space="preserve"> </w:t>
       </w:r>
       <w:r>
         <w:rPr>
+          <w:rtl/>
+          <w:cs/>
           <w:lang w:val="ar_AE" w:bidi="ar_AE"/>
         </w:rPr>
         <w:t>معناه "القوي". كان هذا هو رئيس الآلهة الكنعانية. كان الإله "إل" يسكن في موضع بعيد عن كنعان، "عند منبع النهرين" (ربما يشير هذا إلى جنة عدن)، وكان يرأس مجمعًا من الآلهة هم أولاده. وفي العهد القديم، يشير الاسم "إل" (إلوهيم في صيغة الجمع ) إلى الله، لكن إله شعب إسرائيل كان مختلفًا عن إله الكنعانيين.</w:t>
@@ -373,11 +453,15 @@
       </w:pPr>
       <w:r>
         <w:rPr>
-          <w:lang w:val="ar_AE" w:bidi="ar_AE"/>
-        </w:rPr>
-      </w:r>
-      <w:r>
-        <w:rPr>
+          <w:rtl/>
+          <w:cs/>
+          <w:lang w:val="ar_AE" w:bidi="ar_AE"/>
+        </w:rPr>
+      </w:r>
+      <w:r>
+        <w:rPr>
+          <w:rtl/>
+          <w:cs/>
           <w:lang w:val="ar_AE" w:bidi="ar_AE"/>
         </w:rPr>
         <w:t>الاسم "بعل" معناه "سيد". كان هذا هو إله العواصف العظيم وملك الآلهة. ومع أن "إل" كان الرئيس، كان البعل يتمتع بقوة أكثر نشاطًا بصفته الثاني في ترتيب القيادة بعد "إل". وكان مصدرًَا لكلِّ خصوبة. وعندما كان البعل يموت، كانت النباتات تتوقف عن النمو والحيوانات تتوقف عن التكاثر. وقد كان إله العدالة، وكان يثير الخوف في نفوس الذين يرتكبون الأخطاء.</w:t>
@@ -392,11 +476,15 @@
       </w:pPr>
       <w:r>
         <w:rPr>
-          <w:lang w:val="ar_AE" w:bidi="ar_AE"/>
-        </w:rPr>
-      </w:r>
-      <w:r>
-        <w:rPr>
+          <w:rtl/>
+          <w:cs/>
+          <w:lang w:val="ar_AE" w:bidi="ar_AE"/>
+        </w:rPr>
+      </w:r>
+      <w:r>
+        <w:rPr>
+          <w:rtl/>
+          <w:cs/>
           <w:lang w:val="ar_AE" w:bidi="ar_AE"/>
         </w:rPr>
         <w:t>الاسم "داجون" معناه "سمك" أو "حبوب". وهو يُدعَى أحيانًا أبًا للبعل. كان داجون هو الإله الأساسي لمدينة أشدود الفلسطينية (</w:t>
@@ -404,6 +492,8 @@
       <w:hyperlink r:id="rId13">
         <w:r>
           <w:rPr>
+            <w:rtl/>
+            <w:cs/>
             <w:lang w:val="ar_AE" w:bidi="ar_AE"/>
           </w:rPr>
           <w:rPr>
@@ -415,6 +505,8 @@
       </w:hyperlink>
       <w:r>
         <w:rPr>
+          <w:rtl/>
+          <w:cs/>
           <w:lang w:val="ar_AE" w:bidi="ar_AE"/>
         </w:rPr>
         <w:t>).</w:t>
@@ -429,11 +521,15 @@
       </w:pPr>
       <w:r>
         <w:rPr>
-          <w:lang w:val="ar_AE" w:bidi="ar_AE"/>
-        </w:rPr>
-      </w:r>
-      <w:r>
-        <w:rPr>
+          <w:rtl/>
+          <w:cs/>
+          <w:lang w:val="ar_AE" w:bidi="ar_AE"/>
+        </w:rPr>
+      </w:r>
+      <w:r>
+        <w:rPr>
+          <w:rtl/>
+          <w:cs/>
           <w:lang w:val="ar_AE" w:bidi="ar_AE"/>
         </w:rPr>
         <w:t>عشتاروث، وعناة، والسارية كانت الآلهات الرئيسية الثلاث في مجموعة الآلهة الكنعانية. وكانت متصلة بشكل أساسي بالجنس والحرب. وكان دورها الرئيسي هو إقامة علاقات جنسية سنوية مع البعل، الأمر الذي كان يحافظ على قوة البعل ويضمن خصوبة الأرض.</w:t>
@@ -445,11 +541,15 @@
       </w:pPr>
       <w:r>
         <w:rPr>
-          <w:lang w:val="ar_AE" w:bidi="ar_AE"/>
-        </w:rPr>
-      </w:r>
-      <w:r>
-        <w:rPr>
+          <w:rtl/>
+          <w:cs/>
+          <w:lang w:val="ar_AE" w:bidi="ar_AE"/>
+        </w:rPr>
+      </w:r>
+      <w:r>
+        <w:rPr>
+          <w:rtl/>
+          <w:cs/>
           <w:lang w:val="ar_AE" w:bidi="ar_AE"/>
         </w:rPr>
         <w:t>كان الكنعانيون يعتقدون أن قوى الطبيعة هي التي تفسِّر تغيُّر الفصول. فمن شهر أبريل إلى شهر أكتوبر، كانوا يعتبرون أن جفاف هذه الفترة يرجع إلى موت البعل، بعد هزيمته في معركة تحدث كلَّ ربيع. وكانت أمطار الخريف تشير إلى عودة البعل إلى الحياة بصفته إله المطر والنباتات، وكان هذا يستمر حتى شهر أبريل التالي. وكانوا يعتقدون أن الأرض أصبحت خصبة مرة أخرى بسبب التزاوج السنوي للبعل مع شريكته الأنثى. واشتملت أنشطتهم الدينية على محاكاة أفعال آلهتهم.</w:t>
@@ -461,11 +561,15 @@
       </w:pPr>
       <w:r>
         <w:rPr>
-          <w:lang w:val="ar_AE" w:bidi="ar_AE"/>
-        </w:rPr>
-      </w:r>
-      <w:r>
-        <w:rPr>
+          <w:rtl/>
+          <w:cs/>
+          <w:lang w:val="ar_AE" w:bidi="ar_AE"/>
+        </w:rPr>
+      </w:r>
+      <w:r>
+        <w:rPr>
+          <w:rtl/>
+          <w:cs/>
           <w:lang w:val="ar_AE" w:bidi="ar_AE"/>
         </w:rPr>
         <w:t xml:space="preserve">كان الكنعانيون يعبدون الأشياء التي كانوا يعتقدون أنها ستجلب لهم فوائد مادية. فإذا أرضوا الآلهة والإلهات، ستمدُّهم هذه الآلهة بحصاد جيد. وإذا غضب أيُّ إله، كان الناس يقدِّمون ذبائح حيوانية أو بشرية لتهدئته (انظر </w:t>
@@ -473,6 +577,8 @@
       <w:hyperlink r:id="rId14">
         <w:r>
           <w:rPr>
+            <w:rtl/>
+            <w:cs/>
             <w:lang w:val="ar_AE" w:bidi="ar_AE"/>
           </w:rPr>
           <w:rPr>
@@ -484,6 +590,8 @@
       </w:hyperlink>
       <w:r>
         <w:rPr>
+          <w:rtl/>
+          <w:cs/>
           <w:lang w:val="ar_AE" w:bidi="ar_AE"/>
         </w:rPr>
         <w:t>). فقد كانت عبادة الكنعانيين قائمة على الخوف وعلى محاولة التأثير في الآلهة أو تهدئتها.</w:t>
@@ -495,11 +603,15 @@
       </w:pPr>
       <w:r>
         <w:rPr>
-          <w:lang w:val="ar_AE" w:bidi="ar_AE"/>
-        </w:rPr>
-      </w:r>
-      <w:r>
-        <w:rPr>
+          <w:rtl/>
+          <w:cs/>
+          <w:lang w:val="ar_AE" w:bidi="ar_AE"/>
+        </w:rPr>
+      </w:r>
+      <w:r>
+        <w:rPr>
+          <w:rtl/>
+          <w:cs/>
           <w:lang w:val="ar_AE" w:bidi="ar_AE"/>
         </w:rPr>
         <w:t>أدَّى التفاعل بين العديد من ديانات الشرق الأدنى القديم إلى ظهور مشكلات اجتماعية وإلى اقتباس بعض الممارسات الدينية. تبنَّى الأراميون والفلسطينيون الذين سكنوا في كنعان بعض الممارسات الكنعانية. وبالمثل، أدرج الأموريون بعض الممارسات الدينية السومرية في عبادتهم عندما انتقلوا إلى بلاد ما بين النهرين.</w:t>
@@ -511,11 +623,15 @@
       </w:pPr>
       <w:r>
         <w:rPr>
-          <w:lang w:val="ar_AE" w:bidi="ar_AE"/>
-        </w:rPr>
-      </w:r>
-      <w:r>
-        <w:rPr>
+          <w:rtl/>
+          <w:cs/>
+          <w:lang w:val="ar_AE" w:bidi="ar_AE"/>
+        </w:rPr>
+      </w:r>
+      <w:r>
+        <w:rPr>
+          <w:rtl/>
+          <w:cs/>
           <w:lang w:val="ar_AE" w:bidi="ar_AE"/>
         </w:rPr>
         <w:t xml:space="preserve">على النقيض من ذلك، طالب يهوه، إله إسرائيل، بالولاء التام. وكانت عبادته تقوم على الإيمان وليس الخوف. لكن للأسف، لم يحافظ بنو إسرائيل على إيمانهم بالله الواحد (التوحيد)، حيث تبنوا أفكارًا وممارسات وثنية، وعبدوا آلهة كنعانية بطريقتهم. وبهذا، فسد مجتمعهم وأسخطوا الله. ونتيجةً لذلك، أدانهم الله وأرسلهم إلى السبي (انظر </w:t>
@@ -523,6 +639,8 @@
       <w:hyperlink r:id="rId15">
         <w:r>
           <w:rPr>
+            <w:rtl/>
+            <w:cs/>
             <w:lang w:val="ar_AE" w:bidi="ar_AE"/>
           </w:rPr>
           <w:rPr>
@@ -534,6 +652,8 @@
       </w:hyperlink>
       <w:r>
         <w:rPr>
+          <w:rtl/>
+          <w:cs/>
           <w:lang w:val="ar_AE" w:bidi="ar_AE"/>
         </w:rPr>
         <w:t xml:space="preserve"> </w:t>
@@ -541,6 +661,8 @@
       <w:hyperlink r:id="rId16">
         <w:r>
           <w:rPr>
+            <w:rtl/>
+            <w:cs/>
             <w:lang w:val="ar_AE" w:bidi="ar_AE"/>
           </w:rPr>
           <w:rPr>
@@ -552,6 +674,8 @@
       </w:hyperlink>
       <w:r>
         <w:rPr>
+          <w:rtl/>
+          <w:cs/>
           <w:lang w:val="ar_AE" w:bidi="ar_AE"/>
         </w:rPr>
         <w:t>).</w:t>
@@ -563,12 +687,16 @@
       </w:pPr>
       <w:r>
         <w:rPr>
+          <w:rtl/>
+          <w:cs/>
           <w:lang w:val="ar_AE" w:bidi="ar_AE"/>
         </w:rPr>
       </w:r>
       <w:r>
         <w:rPr>
           <w:u w:val="single"/>
+          <w:rtl/>
+          <w:cs/>
           <w:lang w:val="ar_AE" w:bidi="ar_AE"/>
         </w:rPr>
         <w:t>مقاطع كتابية لدراسة أعمق</w:t>
@@ -580,12 +708,16 @@
       </w:pPr>
       <w:r>
         <w:rPr>
+          <w:rtl/>
+          <w:cs/>
           <w:lang w:val="ar_AE" w:bidi="ar_AE"/>
         </w:rPr>
       </w:r>
       <w:hyperlink r:id="rId17">
         <w:r>
           <w:rPr>
+            <w:rtl/>
+            <w:cs/>
             <w:lang w:val="ar_AE" w:bidi="ar_AE"/>
           </w:rPr>
           <w:rPr>
@@ -597,11 +729,15 @@
       </w:hyperlink>
       <w:r>
         <w:rPr>
-          <w:lang w:val="ar_AE" w:bidi="ar_AE"/>
-        </w:rPr>
-      </w:r>
-      <w:r>
-        <w:rPr>
+          <w:rtl/>
+          <w:cs/>
+          <w:lang w:val="ar_AE" w:bidi="ar_AE"/>
+        </w:rPr>
+      </w:r>
+      <w:r>
+        <w:rPr>
+          <w:rtl/>
+          <w:cs/>
           <w:lang w:val="ar_AE" w:bidi="ar_AE"/>
         </w:rPr>
       </w:r>
@@ -612,6 +748,8 @@
       </w:pPr>
       <w:r>
         <w:rPr>
+          <w:rtl/>
+          <w:cs/>
           <w:lang w:val="ar_AE" w:bidi="ar_AE"/>
         </w:rPr>
       </w:r>
@@ -623,12 +761,16 @@
       </w:pPr>
       <w:r>
         <w:rPr>
+          <w:rtl/>
+          <w:cs/>
           <w:lang w:val="ar_AE" w:bidi="ar_AE"/>
         </w:rPr>
         <w:t>دينونة الله لشعبه</w:t>
       </w:r>
       <w:r>
         <w:rPr>
+          <w:rtl/>
+          <w:cs/>
           <w:lang w:val="ar_AE" w:bidi="ar_AE"/>
         </w:rPr>
       </w:r>
@@ -639,11 +781,15 @@
       </w:pPr>
       <w:r>
         <w:rPr>
-          <w:lang w:val="ar_AE" w:bidi="ar_AE"/>
-        </w:rPr>
-      </w:r>
-      <w:r>
-        <w:rPr>
+          <w:rtl/>
+          <w:cs/>
+          <w:lang w:val="ar_AE" w:bidi="ar_AE"/>
+        </w:rPr>
+      </w:r>
+      <w:r>
+        <w:rPr>
+          <w:rtl/>
+          <w:cs/>
           <w:lang w:val="ar_AE" w:bidi="ar_AE"/>
         </w:rPr>
         <w:t>كان ملوك إسرائيل ويهوذا ذوي أهمية كبيرة في تاريخ المملكة المنقسمة. لكن كان للشعب أيضًا التأثير على مجريات الأحداث. فقد اتبع الشعب حكامه الأشرار (</w:t>
@@ -651,6 +797,8 @@
       <w:hyperlink r:id="rId18">
         <w:r>
           <w:rPr>
+            <w:rtl/>
+            <w:cs/>
             <w:lang w:val="ar_AE" w:bidi="ar_AE"/>
           </w:rPr>
           <w:rPr>
@@ -662,6 +810,8 @@
       </w:hyperlink>
       <w:r>
         <w:rPr>
+          <w:rtl/>
+          <w:cs/>
           <w:lang w:val="ar_AE" w:bidi="ar_AE"/>
         </w:rPr>
         <w:t xml:space="preserve">; </w:t>
@@ -669,6 +819,8 @@
       <w:hyperlink r:id="rId19">
         <w:r>
           <w:rPr>
+            <w:rtl/>
+            <w:cs/>
             <w:lang w:val="ar_AE" w:bidi="ar_AE"/>
           </w:rPr>
           <w:rPr>
@@ -680,6 +832,8 @@
       </w:hyperlink>
       <w:r>
         <w:rPr>
+          <w:rtl/>
+          <w:cs/>
           <w:lang w:val="ar_AE" w:bidi="ar_AE"/>
         </w:rPr>
         <w:t xml:space="preserve">; </w:t>
@@ -687,6 +841,8 @@
       <w:hyperlink r:id="rId20">
         <w:r>
           <w:rPr>
+            <w:rtl/>
+            <w:cs/>
             <w:lang w:val="ar_AE" w:bidi="ar_AE"/>
           </w:rPr>
           <w:rPr>
@@ -698,6 +854,8 @@
       </w:hyperlink>
       <w:r>
         <w:rPr>
+          <w:rtl/>
+          <w:cs/>
           <w:lang w:val="ar_AE" w:bidi="ar_AE"/>
         </w:rPr>
         <w:t xml:space="preserve">, </w:t>
@@ -705,6 +863,8 @@
       <w:hyperlink r:id="rId21">
         <w:r>
           <w:rPr>
+            <w:rtl/>
+            <w:cs/>
             <w:lang w:val="ar_AE" w:bidi="ar_AE"/>
           </w:rPr>
           <w:rPr>
@@ -716,6 +876,8 @@
       </w:hyperlink>
       <w:r>
         <w:rPr>
+          <w:rtl/>
+          <w:cs/>
           <w:lang w:val="ar_AE" w:bidi="ar_AE"/>
         </w:rPr>
         <w:t xml:space="preserve">, </w:t>
@@ -723,6 +885,8 @@
       <w:hyperlink r:id="rId22">
         <w:r>
           <w:rPr>
+            <w:rtl/>
+            <w:cs/>
             <w:lang w:val="ar_AE" w:bidi="ar_AE"/>
           </w:rPr>
           <w:rPr>
@@ -734,6 +898,8 @@
       </w:hyperlink>
       <w:r>
         <w:rPr>
+          <w:rtl/>
+          <w:cs/>
           <w:lang w:val="ar_AE" w:bidi="ar_AE"/>
         </w:rPr>
         <w:t>). وتوقفوا عن طاعة الله (</w:t>
@@ -741,6 +907,8 @@
       <w:hyperlink r:id="rId23">
         <w:r>
           <w:rPr>
+            <w:rtl/>
+            <w:cs/>
             <w:lang w:val="ar_AE" w:bidi="ar_AE"/>
           </w:rPr>
           <w:rPr>
@@ -752,6 +920,8 @@
       </w:hyperlink>
       <w:r>
         <w:rPr>
+          <w:rtl/>
+          <w:cs/>
           <w:lang w:val="ar_AE" w:bidi="ar_AE"/>
         </w:rPr>
         <w:t xml:space="preserve">; </w:t>
@@ -759,6 +929,8 @@
       <w:hyperlink r:id="rId24">
         <w:r>
           <w:rPr>
+            <w:rtl/>
+            <w:cs/>
             <w:lang w:val="ar_AE" w:bidi="ar_AE"/>
           </w:rPr>
           <w:rPr>
@@ -770,6 +942,8 @@
       </w:hyperlink>
       <w:r>
         <w:rPr>
+          <w:rtl/>
+          <w:cs/>
           <w:lang w:val="ar_AE" w:bidi="ar_AE"/>
         </w:rPr>
         <w:t xml:space="preserve">; </w:t>
@@ -777,6 +951,8 @@
       <w:hyperlink r:id="rId25">
         <w:r>
           <w:rPr>
+            <w:rtl/>
+            <w:cs/>
             <w:lang w:val="ar_AE" w:bidi="ar_AE"/>
           </w:rPr>
           <w:rPr>
@@ -788,6 +964,8 @@
       </w:hyperlink>
       <w:r>
         <w:rPr>
+          <w:rtl/>
+          <w:cs/>
           <w:lang w:val="ar_AE" w:bidi="ar_AE"/>
         </w:rPr>
         <w:t xml:space="preserve">, </w:t>
@@ -795,6 +973,8 @@
       <w:hyperlink r:id="rId26">
         <w:r>
           <w:rPr>
+            <w:rtl/>
+            <w:cs/>
             <w:lang w:val="ar_AE" w:bidi="ar_AE"/>
           </w:rPr>
           <w:rPr>
@@ -806,6 +986,8 @@
       </w:hyperlink>
       <w:r>
         <w:rPr>
+          <w:rtl/>
+          <w:cs/>
           <w:lang w:val="ar_AE" w:bidi="ar_AE"/>
         </w:rPr>
         <w:t xml:space="preserve">; </w:t>
@@ -813,6 +995,8 @@
       <w:hyperlink r:id="rId27">
         <w:r>
           <w:rPr>
+            <w:rtl/>
+            <w:cs/>
             <w:lang w:val="ar_AE" w:bidi="ar_AE"/>
           </w:rPr>
           <w:rPr>
@@ -824,6 +1008,8 @@
       </w:hyperlink>
       <w:r>
         <w:rPr>
+          <w:rtl/>
+          <w:cs/>
           <w:lang w:val="ar_AE" w:bidi="ar_AE"/>
         </w:rPr>
         <w:t xml:space="preserve">; </w:t>
@@ -831,6 +1017,8 @@
       <w:hyperlink r:id="rId28">
         <w:r>
           <w:rPr>
+            <w:rtl/>
+            <w:cs/>
             <w:lang w:val="ar_AE" w:bidi="ar_AE"/>
           </w:rPr>
           <w:rPr>
@@ -842,6 +1030,8 @@
       </w:hyperlink>
       <w:r>
         <w:rPr>
+          <w:rtl/>
+          <w:cs/>
           <w:lang w:val="ar_AE" w:bidi="ar_AE"/>
         </w:rPr>
         <w:t xml:space="preserve">; </w:t>
@@ -849,6 +1039,8 @@
       <w:hyperlink r:id="rId29">
         <w:r>
           <w:rPr>
+            <w:rtl/>
+            <w:cs/>
             <w:lang w:val="ar_AE" w:bidi="ar_AE"/>
           </w:rPr>
           <w:rPr>
@@ -860,6 +1052,8 @@
       </w:hyperlink>
       <w:r>
         <w:rPr>
+          <w:rtl/>
+          <w:cs/>
           <w:lang w:val="ar_AE" w:bidi="ar_AE"/>
         </w:rPr>
         <w:t>). كما شارك بني إسرائيل في الممارسات الدينية التي بدأها يربعام الأول (</w:t>
@@ -867,6 +1061,8 @@
       <w:hyperlink r:id="rId30">
         <w:r>
           <w:rPr>
+            <w:rtl/>
+            <w:cs/>
             <w:lang w:val="ar_AE" w:bidi="ar_AE"/>
           </w:rPr>
           <w:rPr>
@@ -878,6 +1074,8 @@
       </w:hyperlink>
       <w:r>
         <w:rPr>
+          <w:rtl/>
+          <w:cs/>
           <w:lang w:val="ar_AE" w:bidi="ar_AE"/>
         </w:rPr>
         <w:t xml:space="preserve">; </w:t>
@@ -885,6 +1083,8 @@
       <w:hyperlink r:id="rId31">
         <w:r>
           <w:rPr>
+            <w:rtl/>
+            <w:cs/>
             <w:lang w:val="ar_AE" w:bidi="ar_AE"/>
           </w:rPr>
           <w:rPr>
@@ -896,6 +1096,8 @@
       </w:hyperlink>
       <w:r>
         <w:rPr>
+          <w:rtl/>
+          <w:cs/>
           <w:lang w:val="ar_AE" w:bidi="ar_AE"/>
         </w:rPr>
         <w:t>)، وعبدوا في المزارات الوثنية (أماكن للعبادة الوثنية) (</w:t>
@@ -903,6 +1105,8 @@
       <w:hyperlink r:id="rId23">
         <w:r>
           <w:rPr>
+            <w:rtl/>
+            <w:cs/>
             <w:lang w:val="ar_AE" w:bidi="ar_AE"/>
           </w:rPr>
           <w:rPr>
@@ -914,6 +1118,8 @@
       </w:hyperlink>
       <w:r>
         <w:rPr>
+          <w:rtl/>
+          <w:cs/>
           <w:lang w:val="ar_AE" w:bidi="ar_AE"/>
         </w:rPr>
         <w:t xml:space="preserve">; </w:t>
@@ -921,6 +1127,8 @@
       <w:hyperlink r:id="rId24">
         <w:r>
           <w:rPr>
+            <w:rtl/>
+            <w:cs/>
             <w:lang w:val="ar_AE" w:bidi="ar_AE"/>
           </w:rPr>
           <w:rPr>
@@ -932,6 +1140,8 @@
       </w:hyperlink>
       <w:r>
         <w:rPr>
+          <w:rtl/>
+          <w:cs/>
           <w:lang w:val="ar_AE" w:bidi="ar_AE"/>
         </w:rPr>
         <w:t xml:space="preserve">; </w:t>
@@ -939,6 +1149,8 @@
       <w:hyperlink r:id="rId25">
         <w:r>
           <w:rPr>
+            <w:rtl/>
+            <w:cs/>
             <w:lang w:val="ar_AE" w:bidi="ar_AE"/>
           </w:rPr>
           <w:rPr>
@@ -950,6 +1162,8 @@
       </w:hyperlink>
       <w:r>
         <w:rPr>
+          <w:rtl/>
+          <w:cs/>
           <w:lang w:val="ar_AE" w:bidi="ar_AE"/>
         </w:rPr>
         <w:t xml:space="preserve">, </w:t>
@@ -957,6 +1171,8 @@
       <w:hyperlink r:id="rId26">
         <w:r>
           <w:rPr>
+            <w:rtl/>
+            <w:cs/>
             <w:lang w:val="ar_AE" w:bidi="ar_AE"/>
           </w:rPr>
           <w:rPr>
@@ -968,6 +1184,8 @@
       </w:hyperlink>
       <w:r>
         <w:rPr>
+          <w:rtl/>
+          <w:cs/>
           <w:lang w:val="ar_AE" w:bidi="ar_AE"/>
         </w:rPr>
         <w:t xml:space="preserve">; </w:t>
@@ -975,6 +1193,8 @@
       <w:hyperlink r:id="rId28">
         <w:r>
           <w:rPr>
+            <w:rtl/>
+            <w:cs/>
             <w:lang w:val="ar_AE" w:bidi="ar_AE"/>
           </w:rPr>
           <w:rPr>
@@ -986,6 +1206,8 @@
       </w:hyperlink>
       <w:r>
         <w:rPr>
+          <w:rtl/>
+          <w:cs/>
           <w:lang w:val="ar_AE" w:bidi="ar_AE"/>
         </w:rPr>
         <w:t>).</w:t>
@@ -997,11 +1219,15 @@
       </w:pPr>
       <w:r>
         <w:rPr>
-          <w:lang w:val="ar_AE" w:bidi="ar_AE"/>
-        </w:rPr>
-      </w:r>
-      <w:r>
-        <w:rPr>
+          <w:rtl/>
+          <w:cs/>
+          <w:lang w:val="ar_AE" w:bidi="ar_AE"/>
+        </w:rPr>
+      </w:r>
+      <w:r>
+        <w:rPr>
+          <w:rtl/>
+          <w:cs/>
           <w:lang w:val="ar_AE" w:bidi="ar_AE"/>
         </w:rPr>
         <w:t>خلال هذه الفترة، تصف الكتابات المقدسة أحيانًا شعب الله بشكل إيجابي. فقد احتفل شعب يهوذا عندما أزالوا الملكة عثليا وأصبح يواش ملكًا (</w:t>
@@ -1009,6 +1235,8 @@
       <w:hyperlink r:id="rId32">
         <w:r>
           <w:rPr>
+            <w:rtl/>
+            <w:cs/>
             <w:lang w:val="ar_AE" w:bidi="ar_AE"/>
           </w:rPr>
           <w:rPr>
@@ -1020,6 +1248,8 @@
       </w:hyperlink>
       <w:r>
         <w:rPr>
+          <w:rtl/>
+          <w:cs/>
           <w:lang w:val="ar_AE" w:bidi="ar_AE"/>
         </w:rPr>
         <w:t xml:space="preserve">, </w:t>
@@ -1027,6 +1257,8 @@
       <w:hyperlink r:id="rId33">
         <w:r>
           <w:rPr>
+            <w:rtl/>
+            <w:cs/>
             <w:lang w:val="ar_AE" w:bidi="ar_AE"/>
           </w:rPr>
           <w:rPr>
@@ -1038,6 +1270,8 @@
       </w:hyperlink>
       <w:r>
         <w:rPr>
+          <w:rtl/>
+          <w:cs/>
           <w:lang w:val="ar_AE" w:bidi="ar_AE"/>
         </w:rPr>
         <w:t>). وأحيانًا ساهم الشعب في اختيار ملوك جدد أو اتبعوا قادة صالحين (</w:t>
@@ -1045,6 +1279,8 @@
       <w:hyperlink r:id="rId34">
         <w:r>
           <w:rPr>
+            <w:rtl/>
+            <w:cs/>
             <w:lang w:val="ar_AE" w:bidi="ar_AE"/>
           </w:rPr>
           <w:rPr>
@@ -1056,6 +1292,8 @@
       </w:hyperlink>
       <w:r>
         <w:rPr>
+          <w:rtl/>
+          <w:cs/>
           <w:lang w:val="ar_AE" w:bidi="ar_AE"/>
         </w:rPr>
         <w:t xml:space="preserve">; </w:t>
@@ -1063,6 +1301,8 @@
       <w:hyperlink r:id="rId35">
         <w:r>
           <w:rPr>
+            <w:rtl/>
+            <w:cs/>
             <w:lang w:val="ar_AE" w:bidi="ar_AE"/>
           </w:rPr>
           <w:rPr>
@@ -1074,6 +1314,8 @@
       </w:hyperlink>
       <w:r>
         <w:rPr>
+          <w:rtl/>
+          <w:cs/>
           <w:lang w:val="ar_AE" w:bidi="ar_AE"/>
         </w:rPr>
         <w:t xml:space="preserve">; </w:t>
@@ -1081,6 +1323,8 @@
       <w:hyperlink r:id="rId36">
         <w:r>
           <w:rPr>
+            <w:rtl/>
+            <w:cs/>
             <w:lang w:val="ar_AE" w:bidi="ar_AE"/>
           </w:rPr>
           <w:rPr>
@@ -1092,6 +1336,8 @@
       </w:hyperlink>
       <w:r>
         <w:rPr>
+          <w:rtl/>
+          <w:cs/>
           <w:lang w:val="ar_AE" w:bidi="ar_AE"/>
         </w:rPr>
         <w:t xml:space="preserve">; </w:t>
@@ -1099,6 +1345,8 @@
       <w:hyperlink r:id="rId37">
         <w:r>
           <w:rPr>
+            <w:rtl/>
+            <w:cs/>
             <w:lang w:val="ar_AE" w:bidi="ar_AE"/>
           </w:rPr>
           <w:rPr>
@@ -1110,6 +1358,8 @@
       </w:hyperlink>
       <w:r>
         <w:rPr>
+          <w:rtl/>
+          <w:cs/>
           <w:lang w:val="ar_AE" w:bidi="ar_AE"/>
         </w:rPr>
         <w:t xml:space="preserve">; </w:t>
@@ -1117,6 +1367,8 @@
       <w:hyperlink r:id="rId38">
         <w:r>
           <w:rPr>
+            <w:rtl/>
+            <w:cs/>
             <w:lang w:val="ar_AE" w:bidi="ar_AE"/>
           </w:rPr>
           <w:rPr>
@@ -1128,6 +1380,8 @@
       </w:hyperlink>
       <w:r>
         <w:rPr>
+          <w:rtl/>
+          <w:cs/>
           <w:lang w:val="ar_AE" w:bidi="ar_AE"/>
         </w:rPr>
         <w:t xml:space="preserve">, </w:t>
@@ -1135,6 +1389,8 @@
       <w:hyperlink r:id="rId39">
         <w:r>
           <w:rPr>
+            <w:rtl/>
+            <w:cs/>
             <w:lang w:val="ar_AE" w:bidi="ar_AE"/>
           </w:rPr>
           <w:rPr>
@@ -1146,6 +1402,8 @@
       </w:hyperlink>
       <w:r>
         <w:rPr>
+          <w:rtl/>
+          <w:cs/>
           <w:lang w:val="ar_AE" w:bidi="ar_AE"/>
         </w:rPr>
         <w:t>).</w:t>
@@ -1157,11 +1415,15 @@
       </w:pPr>
       <w:r>
         <w:rPr>
-          <w:lang w:val="ar_AE" w:bidi="ar_AE"/>
-        </w:rPr>
-      </w:r>
-      <w:r>
-        <w:rPr>
+          <w:rtl/>
+          <w:cs/>
+          <w:lang w:val="ar_AE" w:bidi="ar_AE"/>
+        </w:rPr>
+      </w:r>
+      <w:r>
+        <w:rPr>
+          <w:rtl/>
+          <w:cs/>
           <w:lang w:val="ar_AE" w:bidi="ar_AE"/>
         </w:rPr>
         <w:t>استمر الله في تحذير شعبه عن طريق أنبيائه (</w:t>
@@ -1169,6 +1431,8 @@
       <w:hyperlink r:id="rId40">
         <w:r>
           <w:rPr>
+            <w:rtl/>
+            <w:cs/>
             <w:lang w:val="ar_AE" w:bidi="ar_AE"/>
           </w:rPr>
           <w:rPr>
@@ -1180,6 +1444,8 @@
       </w:hyperlink>
       <w:r>
         <w:rPr>
+          <w:rtl/>
+          <w:cs/>
           <w:lang w:val="ar_AE" w:bidi="ar_AE"/>
         </w:rPr>
         <w:t>). ومع ذلك، استمر شعب المملكتين في التمرد ضد الله (</w:t>
@@ -1187,6 +1453,8 @@
       <w:hyperlink r:id="rId41">
         <w:r>
           <w:rPr>
+            <w:rtl/>
+            <w:cs/>
             <w:lang w:val="ar_AE" w:bidi="ar_AE"/>
           </w:rPr>
           <w:rPr>
@@ -1198,6 +1466,8 @@
       </w:hyperlink>
       <w:r>
         <w:rPr>
+          <w:rtl/>
+          <w:cs/>
           <w:lang w:val="ar_AE" w:bidi="ar_AE"/>
         </w:rPr>
         <w:t xml:space="preserve">, </w:t>
@@ -1205,6 +1475,8 @@
       <w:hyperlink r:id="rId19">
         <w:r>
           <w:rPr>
+            <w:rtl/>
+            <w:cs/>
             <w:lang w:val="ar_AE" w:bidi="ar_AE"/>
           </w:rPr>
           <w:rPr>
@@ -1216,6 +1488,8 @@
       </w:hyperlink>
       <w:r>
         <w:rPr>
+          <w:rtl/>
+          <w:cs/>
           <w:lang w:val="ar_AE" w:bidi="ar_AE"/>
         </w:rPr>
         <w:t>). ونتيجة لذلك، أدانهم الله كما وعد (</w:t>
@@ -1223,6 +1497,8 @@
       <w:hyperlink r:id="rId42">
         <w:r>
           <w:rPr>
+            <w:rtl/>
+            <w:cs/>
             <w:lang w:val="ar_AE" w:bidi="ar_AE"/>
           </w:rPr>
           <w:rPr>
@@ -1234,6 +1510,8 @@
       </w:hyperlink>
       <w:r>
         <w:rPr>
+          <w:rtl/>
+          <w:cs/>
           <w:lang w:val="ar_AE" w:bidi="ar_AE"/>
         </w:rPr>
         <w:t xml:space="preserve">; </w:t>
@@ -1241,6 +1519,8 @@
       <w:hyperlink r:id="rId43">
         <w:r>
           <w:rPr>
+            <w:rtl/>
+            <w:cs/>
             <w:lang w:val="ar_AE" w:bidi="ar_AE"/>
           </w:rPr>
           <w:rPr>
@@ -1252,6 +1532,8 @@
       </w:hyperlink>
       <w:r>
         <w:rPr>
+          <w:rtl/>
+          <w:cs/>
           <w:lang w:val="ar_AE" w:bidi="ar_AE"/>
         </w:rPr>
         <w:t xml:space="preserve">; </w:t>
@@ -1259,6 +1541,8 @@
       <w:hyperlink r:id="rId29">
         <w:r>
           <w:rPr>
+            <w:rtl/>
+            <w:cs/>
             <w:lang w:val="ar_AE" w:bidi="ar_AE"/>
           </w:rPr>
           <w:rPr>
@@ -1270,6 +1554,8 @@
       </w:hyperlink>
       <w:r>
         <w:rPr>
+          <w:rtl/>
+          <w:cs/>
           <w:lang w:val="ar_AE" w:bidi="ar_AE"/>
         </w:rPr>
         <w:t xml:space="preserve">; </w:t>
@@ -1277,6 +1563,8 @@
       <w:hyperlink r:id="rId44">
         <w:r>
           <w:rPr>
+            <w:rtl/>
+            <w:cs/>
             <w:lang w:val="ar_AE" w:bidi="ar_AE"/>
           </w:rPr>
           <w:rPr>
@@ -1288,6 +1576,8 @@
       </w:hyperlink>
       <w:r>
         <w:rPr>
+          <w:rtl/>
+          <w:cs/>
           <w:lang w:val="ar_AE" w:bidi="ar_AE"/>
         </w:rPr>
         <w:t xml:space="preserve">; </w:t>
@@ -1295,6 +1585,8 @@
       <w:hyperlink r:id="rId45">
         <w:r>
           <w:rPr>
+            <w:rtl/>
+            <w:cs/>
             <w:lang w:val="ar_AE" w:bidi="ar_AE"/>
           </w:rPr>
           <w:rPr>
@@ -1306,6 +1598,8 @@
       </w:hyperlink>
       <w:r>
         <w:rPr>
+          <w:rtl/>
+          <w:cs/>
           <w:lang w:val="ar_AE" w:bidi="ar_AE"/>
         </w:rPr>
         <w:t xml:space="preserve">; </w:t>
@@ -1313,6 +1607,8 @@
       <w:hyperlink r:id="rId46">
         <w:r>
           <w:rPr>
+            <w:rtl/>
+            <w:cs/>
             <w:lang w:val="ar_AE" w:bidi="ar_AE"/>
           </w:rPr>
           <w:rPr>
@@ -1324,6 +1620,8 @@
       </w:hyperlink>
       <w:r>
         <w:rPr>
+          <w:rtl/>
+          <w:cs/>
           <w:lang w:val="ar_AE" w:bidi="ar_AE"/>
         </w:rPr>
         <w:t>). لقد تصرّف الله وفقًا لشروط عهده الخاص معهم (</w:t>
@@ -1331,6 +1629,8 @@
       <w:hyperlink r:id="rId47">
         <w:r>
           <w:rPr>
+            <w:rtl/>
+            <w:cs/>
             <w:lang w:val="ar_AE" w:bidi="ar_AE"/>
           </w:rPr>
           <w:rPr>
@@ -1342,6 +1642,8 @@
       </w:hyperlink>
       <w:r>
         <w:rPr>
+          <w:rtl/>
+          <w:cs/>
           <w:lang w:val="ar_AE" w:bidi="ar_AE"/>
         </w:rPr>
         <w:t>).</w:t>
@@ -1353,11 +1655,15 @@
       </w:pPr>
       <w:r>
         <w:rPr>
-          <w:lang w:val="ar_AE" w:bidi="ar_AE"/>
-        </w:rPr>
-      </w:r>
-      <w:r>
-        <w:rPr>
+          <w:rtl/>
+          <w:cs/>
+          <w:lang w:val="ar_AE" w:bidi="ar_AE"/>
+        </w:rPr>
+      </w:r>
+      <w:r>
+        <w:rPr>
+          <w:rtl/>
+          <w:cs/>
           <w:lang w:val="ar_AE" w:bidi="ar_AE"/>
         </w:rPr>
         <w:t xml:space="preserve">ومع ذلك، استمر الله في محبته لشعبه ورغب في استردادهم (انظر </w:t>
@@ -1365,6 +1671,8 @@
       <w:hyperlink r:id="rId48">
         <w:r>
           <w:rPr>
+            <w:rtl/>
+            <w:cs/>
             <w:lang w:val="ar_AE" w:bidi="ar_AE"/>
           </w:rPr>
           <w:rPr>
@@ -1376,6 +1684,8 @@
       </w:hyperlink>
       <w:r>
         <w:rPr>
+          <w:rtl/>
+          <w:cs/>
           <w:lang w:val="ar_AE" w:bidi="ar_AE"/>
         </w:rPr>
         <w:t>). فقد كان الله يهتم بشعبه دائمًا. لقد أنقذهم من سنحاريب (</w:t>
@@ -1383,6 +1693,8 @@
       <w:hyperlink r:id="rId49">
         <w:r>
           <w:rPr>
+            <w:rtl/>
+            <w:cs/>
             <w:lang w:val="ar_AE" w:bidi="ar_AE"/>
           </w:rPr>
           <w:rPr>
@@ -1394,6 +1706,8 @@
       </w:hyperlink>
       <w:r>
         <w:rPr>
+          <w:rtl/>
+          <w:cs/>
           <w:lang w:val="ar_AE" w:bidi="ar_AE"/>
         </w:rPr>
         <w:t>). ووعد بأن بقيّة صغيرة منهم ستزدهر مرة أخرى في الأرض (</w:t>
@@ -1401,6 +1715,8 @@
       <w:hyperlink r:id="rId50">
         <w:r>
           <w:rPr>
+            <w:rtl/>
+            <w:cs/>
             <w:lang w:val="ar_AE" w:bidi="ar_AE"/>
           </w:rPr>
           <w:rPr>
@@ -1412,6 +1728,8 @@
       </w:hyperlink>
       <w:r>
         <w:rPr>
+          <w:rtl/>
+          <w:cs/>
           <w:lang w:val="ar_AE" w:bidi="ar_AE"/>
         </w:rPr>
         <w:t>). وقد يكون حسن المعاملة التي تلقاها الملك يهوياكين في بابل قد جدد الأمل لدى الشعب التائب (</w:t>
@@ -1419,6 +1737,8 @@
       <w:hyperlink r:id="rId51">
         <w:r>
           <w:rPr>
+            <w:rtl/>
+            <w:cs/>
             <w:lang w:val="ar_AE" w:bidi="ar_AE"/>
           </w:rPr>
           <w:rPr>
@@ -1430,6 +1750,8 @@
       </w:hyperlink>
       <w:r>
         <w:rPr>
+          <w:rtl/>
+          <w:cs/>
           <w:lang w:val="ar_AE" w:bidi="ar_AE"/>
         </w:rPr>
         <w:t>).</w:t>
@@ -1441,11 +1763,15 @@
       </w:pPr>
       <w:r>
         <w:rPr>
-          <w:lang w:val="ar_AE" w:bidi="ar_AE"/>
-        </w:rPr>
-      </w:r>
-      <w:r>
-        <w:rPr>
+          <w:rtl/>
+          <w:cs/>
+          <w:lang w:val="ar_AE" w:bidi="ar_AE"/>
+        </w:rPr>
+      </w:r>
+      <w:r>
+        <w:rPr>
+          <w:rtl/>
+          <w:cs/>
           <w:lang w:val="ar_AE" w:bidi="ar_AE"/>
         </w:rPr>
         <w:t>لقد وعد الله باسترداد شعبه من السبي، وأن يمنحهم شركة معه في الأرض من جديد. كما وعد أن يملك عليهم من خلال ملكه المختار، الذي هو من نسل داود (</w:t>
@@ -1453,6 +1779,8 @@
       <w:hyperlink r:id="rId52">
         <w:r>
           <w:rPr>
+            <w:rtl/>
+            <w:cs/>
             <w:lang w:val="ar_AE" w:bidi="ar_AE"/>
           </w:rPr>
           <w:rPr>
@@ -1464,6 +1792,8 @@
       </w:hyperlink>
       <w:r>
         <w:rPr>
+          <w:rtl/>
+          <w:cs/>
           <w:lang w:val="ar_AE" w:bidi="ar_AE"/>
         </w:rPr>
         <w:t xml:space="preserve">; انظر أيضًا </w:t>
@@ -1471,6 +1801,8 @@
       <w:hyperlink r:id="rId53">
         <w:r>
           <w:rPr>
+            <w:rtl/>
+            <w:cs/>
             <w:lang w:val="ar_AE" w:bidi="ar_AE"/>
           </w:rPr>
           <w:rPr>
@@ -1482,6 +1814,8 @@
       </w:hyperlink>
       <w:r>
         <w:rPr>
+          <w:rtl/>
+          <w:cs/>
           <w:lang w:val="ar_AE" w:bidi="ar_AE"/>
         </w:rPr>
         <w:t xml:space="preserve">; </w:t>
@@ -1489,6 +1823,8 @@
       <w:hyperlink r:id="rId54">
         <w:r>
           <w:rPr>
+            <w:rtl/>
+            <w:cs/>
             <w:lang w:val="ar_AE" w:bidi="ar_AE"/>
           </w:rPr>
           <w:rPr>
@@ -1500,6 +1836,8 @@
       </w:hyperlink>
       <w:r>
         <w:rPr>
+          <w:rtl/>
+          <w:cs/>
           <w:lang w:val="ar_AE" w:bidi="ar_AE"/>
         </w:rPr>
         <w:t>).</w:t>
@@ -1511,12 +1849,16 @@
       </w:pPr>
       <w:r>
         <w:rPr>
+          <w:rtl/>
+          <w:cs/>
           <w:lang w:val="ar_AE" w:bidi="ar_AE"/>
         </w:rPr>
       </w:r>
       <w:r>
         <w:rPr>
           <w:u w:val="single"/>
+          <w:rtl/>
+          <w:cs/>
           <w:lang w:val="ar_AE" w:bidi="ar_AE"/>
         </w:rPr>
         <w:t>مقاطع لمزيد من الدراسة</w:t>
@@ -1528,12 +1870,16 @@
       </w:pPr>
       <w:r>
         <w:rPr>
+          <w:rtl/>
+          <w:cs/>
           <w:lang w:val="ar_AE" w:bidi="ar_AE"/>
         </w:rPr>
       </w:r>
       <w:hyperlink r:id="rId47">
         <w:r>
           <w:rPr>
+            <w:rtl/>
+            <w:cs/>
             <w:lang w:val="ar_AE" w:bidi="ar_AE"/>
           </w:rPr>
           <w:rPr>
@@ -1545,6 +1891,8 @@
       </w:hyperlink>
       <w:r>
         <w:rPr>
+          <w:rtl/>
+          <w:cs/>
           <w:lang w:val="ar_AE" w:bidi="ar_AE"/>
         </w:rPr>
         <w:t xml:space="preserve">; </w:t>
@@ -1552,6 +1900,8 @@
       <w:hyperlink r:id="rId55">
         <w:r>
           <w:rPr>
+            <w:rtl/>
+            <w:cs/>
             <w:lang w:val="ar_AE" w:bidi="ar_AE"/>
           </w:rPr>
           <w:rPr>
@@ -1563,6 +1913,8 @@
       </w:hyperlink>
       <w:r>
         <w:rPr>
+          <w:rtl/>
+          <w:cs/>
           <w:lang w:val="ar_AE" w:bidi="ar_AE"/>
         </w:rPr>
         <w:t xml:space="preserve">; </w:t>
@@ -1570,6 +1922,8 @@
       <w:hyperlink r:id="rId56">
         <w:r>
           <w:rPr>
+            <w:rtl/>
+            <w:cs/>
             <w:lang w:val="ar_AE" w:bidi="ar_AE"/>
           </w:rPr>
           <w:rPr>
@@ -1581,6 +1935,8 @@
       </w:hyperlink>
       <w:r>
         <w:rPr>
+          <w:rtl/>
+          <w:cs/>
           <w:lang w:val="ar_AE" w:bidi="ar_AE"/>
         </w:rPr>
         <w:t xml:space="preserve">; </w:t>
@@ -1588,6 +1944,8 @@
       <w:hyperlink r:id="rId44">
         <w:r>
           <w:rPr>
+            <w:rtl/>
+            <w:cs/>
             <w:lang w:val="ar_AE" w:bidi="ar_AE"/>
           </w:rPr>
           <w:rPr>
@@ -1599,6 +1957,8 @@
       </w:hyperlink>
       <w:r>
         <w:rPr>
+          <w:rtl/>
+          <w:cs/>
           <w:lang w:val="ar_AE" w:bidi="ar_AE"/>
         </w:rPr>
         <w:t xml:space="preserve">; </w:t>
@@ -1606,6 +1966,8 @@
       <w:hyperlink r:id="rId57">
         <w:r>
           <w:rPr>
+            <w:rtl/>
+            <w:cs/>
             <w:lang w:val="ar_AE" w:bidi="ar_AE"/>
           </w:rPr>
           <w:rPr>
@@ -1617,6 +1979,8 @@
       </w:hyperlink>
       <w:r>
         <w:rPr>
+          <w:rtl/>
+          <w:cs/>
           <w:lang w:val="ar_AE" w:bidi="ar_AE"/>
         </w:rPr>
         <w:t xml:space="preserve">; </w:t>
@@ -1624,6 +1988,8 @@
       <w:hyperlink r:id="rId58">
         <w:r>
           <w:rPr>
+            <w:rtl/>
+            <w:cs/>
             <w:lang w:val="ar_AE" w:bidi="ar_AE"/>
           </w:rPr>
           <w:rPr>
@@ -1635,6 +2001,8 @@
       </w:hyperlink>
       <w:r>
         <w:rPr>
+          <w:rtl/>
+          <w:cs/>
           <w:lang w:val="ar_AE" w:bidi="ar_AE"/>
         </w:rPr>
         <w:t xml:space="preserve">; </w:t>
@@ -1642,6 +2010,8 @@
       <w:hyperlink r:id="rId59">
         <w:r>
           <w:rPr>
+            <w:rtl/>
+            <w:cs/>
             <w:lang w:val="ar_AE" w:bidi="ar_AE"/>
           </w:rPr>
           <w:rPr>
@@ -1653,6 +2023,8 @@
       </w:hyperlink>
       <w:r>
         <w:rPr>
+          <w:rtl/>
+          <w:cs/>
           <w:lang w:val="ar_AE" w:bidi="ar_AE"/>
         </w:rPr>
         <w:t xml:space="preserve">; </w:t>
@@ -1660,6 +2032,8 @@
       <w:hyperlink r:id="rId60">
         <w:r>
           <w:rPr>
+            <w:rtl/>
+            <w:cs/>
             <w:lang w:val="ar_AE" w:bidi="ar_AE"/>
           </w:rPr>
           <w:rPr>
@@ -1671,6 +2045,8 @@
       </w:hyperlink>
       <w:r>
         <w:rPr>
+          <w:rtl/>
+          <w:cs/>
           <w:lang w:val="ar_AE" w:bidi="ar_AE"/>
         </w:rPr>
         <w:t xml:space="preserve">; </w:t>
@@ -1678,6 +2054,8 @@
       <w:hyperlink r:id="rId61">
         <w:r>
           <w:rPr>
+            <w:rtl/>
+            <w:cs/>
             <w:lang w:val="ar_AE" w:bidi="ar_AE"/>
           </w:rPr>
           <w:rPr>
@@ -1689,6 +2067,8 @@
       </w:hyperlink>
       <w:r>
         <w:rPr>
+          <w:rtl/>
+          <w:cs/>
           <w:lang w:val="ar_AE" w:bidi="ar_AE"/>
         </w:rPr>
         <w:t xml:space="preserve">; </w:t>
@@ -1696,6 +2076,8 @@
       <w:hyperlink r:id="rId62">
         <w:r>
           <w:rPr>
+            <w:rtl/>
+            <w:cs/>
             <w:lang w:val="ar_AE" w:bidi="ar_AE"/>
           </w:rPr>
           <w:rPr>
@@ -1707,6 +2089,8 @@
       </w:hyperlink>
       <w:r>
         <w:rPr>
+          <w:rtl/>
+          <w:cs/>
           <w:lang w:val="ar_AE" w:bidi="ar_AE"/>
         </w:rPr>
         <w:t xml:space="preserve">; </w:t>
@@ -1714,6 +2098,8 @@
       <w:hyperlink r:id="rId52">
         <w:r>
           <w:rPr>
+            <w:rtl/>
+            <w:cs/>
             <w:lang w:val="ar_AE" w:bidi="ar_AE"/>
           </w:rPr>
           <w:rPr>
@@ -1725,6 +2111,8 @@
       </w:hyperlink>
       <w:r>
         <w:rPr>
+          <w:rtl/>
+          <w:cs/>
           <w:lang w:val="ar_AE" w:bidi="ar_AE"/>
         </w:rPr>
         <w:t xml:space="preserve">; </w:t>
@@ -1732,6 +2120,8 @@
       <w:hyperlink r:id="rId63">
         <w:r>
           <w:rPr>
+            <w:rtl/>
+            <w:cs/>
             <w:lang w:val="ar_AE" w:bidi="ar_AE"/>
           </w:rPr>
           <w:rPr>
@@ -1743,6 +2133,8 @@
       </w:hyperlink>
       <w:r>
         <w:rPr>
+          <w:rtl/>
+          <w:cs/>
           <w:lang w:val="ar_AE" w:bidi="ar_AE"/>
         </w:rPr>
         <w:t xml:space="preserve">; </w:t>
@@ -1750,6 +2142,8 @@
       <w:hyperlink r:id="rId64">
         <w:r>
           <w:rPr>
+            <w:rtl/>
+            <w:cs/>
             <w:lang w:val="ar_AE" w:bidi="ar_AE"/>
           </w:rPr>
           <w:rPr>
@@ -1761,6 +2155,8 @@
       </w:hyperlink>
       <w:r>
         <w:rPr>
+          <w:rtl/>
+          <w:cs/>
           <w:lang w:val="ar_AE" w:bidi="ar_AE"/>
         </w:rPr>
         <w:t xml:space="preserve">; </w:t>
@@ -1768,6 +2164,8 @@
       <w:hyperlink r:id="rId65">
         <w:r>
           <w:rPr>
+            <w:rtl/>
+            <w:cs/>
             <w:lang w:val="ar_AE" w:bidi="ar_AE"/>
           </w:rPr>
           <w:rPr>
@@ -1779,6 +2177,8 @@
       </w:hyperlink>
       <w:r>
         <w:rPr>
+          <w:rtl/>
+          <w:cs/>
           <w:lang w:val="ar_AE" w:bidi="ar_AE"/>
         </w:rPr>
         <w:t xml:space="preserve">; </w:t>
@@ -1786,6 +2186,8 @@
       <w:hyperlink r:id="rId66">
         <w:r>
           <w:rPr>
+            <w:rtl/>
+            <w:cs/>
             <w:lang w:val="ar_AE" w:bidi="ar_AE"/>
           </w:rPr>
           <w:rPr>
@@ -1797,6 +2199,8 @@
       </w:hyperlink>
       <w:r>
         <w:rPr>
+          <w:rtl/>
+          <w:cs/>
           <w:lang w:val="ar_AE" w:bidi="ar_AE"/>
         </w:rPr>
         <w:t xml:space="preserve">; </w:t>
@@ -1804,6 +2208,8 @@
       <w:hyperlink r:id="rId48">
         <w:r>
           <w:rPr>
+            <w:rtl/>
+            <w:cs/>
             <w:lang w:val="ar_AE" w:bidi="ar_AE"/>
           </w:rPr>
           <w:rPr>
@@ -1815,6 +2221,8 @@
       </w:hyperlink>
       <w:r>
         <w:rPr>
+          <w:rtl/>
+          <w:cs/>
           <w:lang w:val="ar_AE" w:bidi="ar_AE"/>
         </w:rPr>
         <w:t xml:space="preserve">; </w:t>
@@ -1822,6 +2230,8 @@
       <w:hyperlink r:id="rId67">
         <w:r>
           <w:rPr>
+            <w:rtl/>
+            <w:cs/>
             <w:lang w:val="ar_AE" w:bidi="ar_AE"/>
           </w:rPr>
           <w:rPr>
@@ -1833,6 +2243,8 @@
       </w:hyperlink>
       <w:r>
         <w:rPr>
+          <w:rtl/>
+          <w:cs/>
           <w:lang w:val="ar_AE" w:bidi="ar_AE"/>
         </w:rPr>
         <w:t xml:space="preserve">; </w:t>
@@ -1840,6 +2252,8 @@
       <w:hyperlink r:id="rId68">
         <w:r>
           <w:rPr>
+            <w:rtl/>
+            <w:cs/>
             <w:lang w:val="ar_AE" w:bidi="ar_AE"/>
           </w:rPr>
           <w:rPr>
@@ -1851,6 +2265,8 @@
       </w:hyperlink>
       <w:r>
         <w:rPr>
+          <w:rtl/>
+          <w:cs/>
           <w:lang w:val="ar_AE" w:bidi="ar_AE"/>
         </w:rPr>
         <w:t xml:space="preserve">; </w:t>
@@ -1858,6 +2274,8 @@
       <w:hyperlink r:id="rId69">
         <w:r>
           <w:rPr>
+            <w:rtl/>
+            <w:cs/>
             <w:lang w:val="ar_AE" w:bidi="ar_AE"/>
           </w:rPr>
           <w:rPr>
@@ -1869,6 +2287,8 @@
       </w:hyperlink>
       <w:r>
         <w:rPr>
+          <w:rtl/>
+          <w:cs/>
           <w:lang w:val="ar_AE" w:bidi="ar_AE"/>
         </w:rPr>
         <w:t xml:space="preserve">; </w:t>
@@ -1876,6 +2296,8 @@
       <w:hyperlink r:id="rId70">
         <w:r>
           <w:rPr>
+            <w:rtl/>
+            <w:cs/>
             <w:lang w:val="ar_AE" w:bidi="ar_AE"/>
           </w:rPr>
           <w:rPr>
@@ -1887,6 +2309,8 @@
       </w:hyperlink>
       <w:r>
         <w:rPr>
+          <w:rtl/>
+          <w:cs/>
           <w:lang w:val="ar_AE" w:bidi="ar_AE"/>
         </w:rPr>
         <w:t xml:space="preserve">; </w:t>
@@ -1894,6 +2318,8 @@
       <w:hyperlink r:id="rId71">
         <w:r>
           <w:rPr>
+            <w:rtl/>
+            <w:cs/>
             <w:lang w:val="ar_AE" w:bidi="ar_AE"/>
           </w:rPr>
           <w:rPr>
@@ -1905,6 +2331,8 @@
       </w:hyperlink>
       <w:r>
         <w:rPr>
+          <w:rtl/>
+          <w:cs/>
           <w:lang w:val="ar_AE" w:bidi="ar_AE"/>
         </w:rPr>
         <w:t xml:space="preserve">; </w:t>
@@ -1912,6 +2340,8 @@
       <w:hyperlink r:id="rId54">
         <w:r>
           <w:rPr>
+            <w:rtl/>
+            <w:cs/>
             <w:lang w:val="ar_AE" w:bidi="ar_AE"/>
           </w:rPr>
           <w:rPr>
@@ -1923,6 +2353,8 @@
       </w:hyperlink>
       <w:r>
         <w:rPr>
+          <w:rtl/>
+          <w:cs/>
           <w:lang w:val="ar_AE" w:bidi="ar_AE"/>
         </w:rPr>
         <w:t xml:space="preserve">; </w:t>
@@ -1930,6 +2362,8 @@
       <w:hyperlink r:id="rId72">
         <w:r>
           <w:rPr>
+            <w:rtl/>
+            <w:cs/>
             <w:lang w:val="ar_AE" w:bidi="ar_AE"/>
           </w:rPr>
           <w:rPr>
@@ -1941,6 +2375,8 @@
       </w:hyperlink>
       <w:r>
         <w:rPr>
+          <w:rtl/>
+          <w:cs/>
           <w:lang w:val="ar_AE" w:bidi="ar_AE"/>
         </w:rPr>
         <w:t xml:space="preserve">; </w:t>
@@ -1948,6 +2384,8 @@
       <w:hyperlink r:id="rId73">
         <w:r>
           <w:rPr>
+            <w:rtl/>
+            <w:cs/>
             <w:lang w:val="ar_AE" w:bidi="ar_AE"/>
           </w:rPr>
           <w:rPr>
@@ -1959,6 +2397,8 @@
       </w:hyperlink>
       <w:r>
         <w:rPr>
+          <w:rtl/>
+          <w:cs/>
           <w:lang w:val="ar_AE" w:bidi="ar_AE"/>
         </w:rPr>
         <w:t xml:space="preserve">; </w:t>
@@ -1966,6 +2406,8 @@
       <w:hyperlink r:id="rId74">
         <w:r>
           <w:rPr>
+            <w:rtl/>
+            <w:cs/>
             <w:lang w:val="ar_AE" w:bidi="ar_AE"/>
           </w:rPr>
           <w:rPr>
@@ -1977,6 +2419,8 @@
       </w:hyperlink>
       <w:r>
         <w:rPr>
+          <w:rtl/>
+          <w:cs/>
           <w:lang w:val="ar_AE" w:bidi="ar_AE"/>
         </w:rPr>
         <w:t xml:space="preserve">; </w:t>
@@ -1984,6 +2428,8 @@
       <w:hyperlink r:id="rId75">
         <w:r>
           <w:rPr>
+            <w:rtl/>
+            <w:cs/>
             <w:lang w:val="ar_AE" w:bidi="ar_AE"/>
           </w:rPr>
           <w:rPr>
@@ -1995,6 +2441,8 @@
       </w:hyperlink>
       <w:r>
         <w:rPr>
+          <w:rtl/>
+          <w:cs/>
           <w:lang w:val="ar_AE" w:bidi="ar_AE"/>
         </w:rPr>
         <w:t xml:space="preserve">; </w:t>
@@ -2002,6 +2450,8 @@
       <w:hyperlink r:id="rId76">
         <w:r>
           <w:rPr>
+            <w:rtl/>
+            <w:cs/>
             <w:lang w:val="ar_AE" w:bidi="ar_AE"/>
           </w:rPr>
           <w:rPr>
@@ -2013,11 +2463,15 @@
       </w:hyperlink>
       <w:r>
         <w:rPr>
-          <w:lang w:val="ar_AE" w:bidi="ar_AE"/>
-        </w:rPr>
-      </w:r>
-      <w:r>
-        <w:rPr>
+          <w:rtl/>
+          <w:cs/>
+          <w:lang w:val="ar_AE" w:bidi="ar_AE"/>
+        </w:rPr>
+      </w:r>
+      <w:r>
+        <w:rPr>
+          <w:rtl/>
+          <w:cs/>
           <w:lang w:val="ar_AE" w:bidi="ar_AE"/>
         </w:rPr>
       </w:r>

</xml_diff>

<commit_message>
Regenerate Arbiter study notes for 2026-08-28
</commit_message>
<xml_diff>
--- a/arb/docx/007.content.docx
+++ b/arb/docx/007.content.docx
@@ -489,20 +489,14 @@
         </w:rPr>
         <w:t>الاسم "داجون" معناه "سمك" أو "حبوب". وهو يُدعَى أحيانًا أبًا للبعل. كان داجون هو الإله الأساسي لمدينة أشدود الفلسطينية (</w:t>
       </w:r>
-      <w:hyperlink r:id="rId13">
-        <w:r>
-          <w:rPr>
-            <w:rtl/>
-            <w:cs/>
-            <w:lang w:val="ar_AE" w:bidi="ar_AE"/>
-          </w:rPr>
-          <w:rPr>
-            <w:color w:val="0000EE"/>
-            <w:u w:val="single"/>
-          </w:rPr>
-          <w:t>1صموئيل 5: 1–7</w:t>
-        </w:r>
-      </w:hyperlink>
+      <w:r>
+        <w:rPr>
+          <w:rtl/>
+          <w:cs/>
+          <w:lang w:val="ar_AE" w:bidi="ar_AE"/>
+        </w:rPr>
+        <w:t>1صموئيل 5: 1–7</w:t>
+      </w:r>
       <w:r>
         <w:rPr>
           <w:rtl/>
@@ -574,20 +568,14 @@
         </w:rPr>
         <w:t xml:space="preserve">كان الكنعانيون يعبدون الأشياء التي كانوا يعتقدون أنها ستجلب لهم فوائد مادية. فإذا أرضوا الآلهة والإلهات، ستمدُّهم هذه الآلهة بحصاد جيد. وإذا غضب أيُّ إله، كان الناس يقدِّمون ذبائح حيوانية أو بشرية لتهدئته (انظر </w:t>
       </w:r>
-      <w:hyperlink r:id="rId14">
-        <w:r>
-          <w:rPr>
-            <w:rtl/>
-            <w:cs/>
-            <w:lang w:val="ar_AE" w:bidi="ar_AE"/>
-          </w:rPr>
-          <w:rPr>
-            <w:color w:val="0000EE"/>
-            <w:u w:val="single"/>
-          </w:rPr>
-          <w:t>2ملوك 3: 26–27</w:t>
-        </w:r>
-      </w:hyperlink>
+      <w:r>
+        <w:rPr>
+          <w:rtl/>
+          <w:cs/>
+          <w:lang w:val="ar_AE" w:bidi="ar_AE"/>
+        </w:rPr>
+        <w:t>2ملوك 3: 26–27</w:t>
+      </w:r>
       <w:r>
         <w:rPr>
           <w:rtl/>
@@ -636,20 +624,14 @@
         </w:rPr>
         <w:t xml:space="preserve">على النقيض من ذلك، طالب يهوه، إله إسرائيل، بالولاء التام. وكانت عبادته تقوم على الإيمان وليس الخوف. لكن للأسف، لم يحافظ بنو إسرائيل على إيمانهم بالله الواحد (التوحيد)، حيث تبنوا أفكارًا وممارسات وثنية، وعبدوا آلهة كنعانية بطريقتهم. وبهذا، فسد مجتمعهم وأسخطوا الله. ونتيجةً لذلك، أدانهم الله وأرسلهم إلى السبي (انظر </w:t>
       </w:r>
-      <w:hyperlink r:id="rId15">
-        <w:r>
-          <w:rPr>
-            <w:rtl/>
-            <w:cs/>
-            <w:lang w:val="ar_AE" w:bidi="ar_AE"/>
-          </w:rPr>
-          <w:rPr>
-            <w:color w:val="0000EE"/>
-            <w:u w:val="single"/>
-          </w:rPr>
-          <w:t>2ملوك 17: 5–23؛</w:t>
-        </w:r>
-      </w:hyperlink>
+      <w:r>
+        <w:rPr>
+          <w:rtl/>
+          <w:cs/>
+          <w:lang w:val="ar_AE" w:bidi="ar_AE"/>
+        </w:rPr>
+        <w:t>2ملوك 17: 5–23؛</w:t>
+      </w:r>
       <w:r>
         <w:rPr>
           <w:rtl/>
@@ -658,20 +640,14 @@
         </w:rPr>
         <w:t xml:space="preserve"> </w:t>
       </w:r>
-      <w:hyperlink r:id="rId16">
-        <w:r>
-          <w:rPr>
-            <w:rtl/>
-            <w:cs/>
-            <w:lang w:val="ar_AE" w:bidi="ar_AE"/>
-          </w:rPr>
-          <w:rPr>
-            <w:color w:val="0000EE"/>
-            <w:u w:val="single"/>
-          </w:rPr>
-          <w:t>24: 18–25:21</w:t>
-        </w:r>
-      </w:hyperlink>
+      <w:r>
+        <w:rPr>
+          <w:rtl/>
+          <w:cs/>
+          <w:lang w:val="ar_AE" w:bidi="ar_AE"/>
+        </w:rPr>
+        <w:t>24: 18–25:21</w:t>
+      </w:r>
       <w:r>
         <w:rPr>
           <w:rtl/>
@@ -713,20 +689,14 @@
           <w:lang w:val="ar_AE" w:bidi="ar_AE"/>
         </w:rPr>
       </w:r>
-      <w:hyperlink r:id="rId17">
-        <w:r>
-          <w:rPr>
-            <w:rtl/>
-            <w:cs/>
-            <w:lang w:val="ar_AE" w:bidi="ar_AE"/>
-          </w:rPr>
-          <w:rPr>
-            <w:color w:val="0000EE"/>
-            <w:u w:val="single"/>
-          </w:rPr>
-          <w:t>1صموئيل 5: 1–12</w:t>
-        </w:r>
-      </w:hyperlink>
+      <w:r>
+        <w:rPr>
+          <w:rtl/>
+          <w:cs/>
+          <w:lang w:val="ar_AE" w:bidi="ar_AE"/>
+        </w:rPr>
+        <w:t>1صموئيل 5: 1–12</w:t>
+      </w:r>
       <w:r>
         <w:rPr>
           <w:rtl/>
@@ -794,20 +764,14 @@
         </w:rPr>
         <w:t>كان ملوك إسرائيل ويهوذا ذوي أهمية كبيرة في تاريخ المملكة المنقسمة. لكن كان للشعب أيضًا التأثير على مجريات الأحداث. فقد اتبع الشعب حكامه الأشرار (</w:t>
       </w:r>
-      <w:hyperlink r:id="rId18">
-        <w:r>
-          <w:rPr>
-            <w:rtl/>
-            <w:cs/>
-            <w:lang w:val="ar_AE" w:bidi="ar_AE"/>
-          </w:rPr>
-          <w:rPr>
-            <w:color w:val="0000EE"/>
-            <w:u w:val="single"/>
-          </w:rPr>
-          <w:t>الملوك الثاني 3:3</w:t>
-        </w:r>
-      </w:hyperlink>
+      <w:r>
+        <w:rPr>
+          <w:rtl/>
+          <w:cs/>
+          <w:lang w:val="ar_AE" w:bidi="ar_AE"/>
+        </w:rPr>
+        <w:t>الملوك الثاني 3:3</w:t>
+      </w:r>
       <w:r>
         <w:rPr>
           <w:rtl/>
@@ -816,20 +780,14 @@
         </w:rPr>
         <w:t xml:space="preserve">; </w:t>
       </w:r>
-      <w:hyperlink r:id="rId19">
-        <w:r>
-          <w:rPr>
-            <w:rtl/>
-            <w:cs/>
-            <w:lang w:val="ar_AE" w:bidi="ar_AE"/>
-          </w:rPr>
-          <w:rPr>
-            <w:color w:val="0000EE"/>
-            <w:u w:val="single"/>
-          </w:rPr>
-          <w:t>17:22</w:t>
-        </w:r>
-      </w:hyperlink>
+      <w:r>
+        <w:rPr>
+          <w:rtl/>
+          <w:cs/>
+          <w:lang w:val="ar_AE" w:bidi="ar_AE"/>
+        </w:rPr>
+        <w:t>17:22</w:t>
+      </w:r>
       <w:r>
         <w:rPr>
           <w:rtl/>
@@ -838,20 +796,14 @@
         </w:rPr>
         <w:t xml:space="preserve">; </w:t>
       </w:r>
-      <w:hyperlink r:id="rId20">
-        <w:r>
-          <w:rPr>
-            <w:rtl/>
-            <w:cs/>
-            <w:lang w:val="ar_AE" w:bidi="ar_AE"/>
-          </w:rPr>
-          <w:rPr>
-            <w:color w:val="0000EE"/>
-            <w:u w:val="single"/>
-          </w:rPr>
-          <w:t>21:9</w:t>
-        </w:r>
-      </w:hyperlink>
+      <w:r>
+        <w:rPr>
+          <w:rtl/>
+          <w:cs/>
+          <w:lang w:val="ar_AE" w:bidi="ar_AE"/>
+        </w:rPr>
+        <w:t>21:9</w:t>
+      </w:r>
       <w:r>
         <w:rPr>
           <w:rtl/>
@@ -860,20 +812,14 @@
         </w:rPr>
         <w:t xml:space="preserve">, </w:t>
       </w:r>
-      <w:hyperlink r:id="rId21">
-        <w:r>
-          <w:rPr>
-            <w:rtl/>
-            <w:cs/>
-            <w:lang w:val="ar_AE" w:bidi="ar_AE"/>
-          </w:rPr>
-          <w:rPr>
-            <w:color w:val="0000EE"/>
-            <w:u w:val="single"/>
-          </w:rPr>
-          <w:t>11</w:t>
-        </w:r>
-      </w:hyperlink>
+      <w:r>
+        <w:rPr>
+          <w:rtl/>
+          <w:cs/>
+          <w:lang w:val="ar_AE" w:bidi="ar_AE"/>
+        </w:rPr>
+        <w:t>11</w:t>
+      </w:r>
       <w:r>
         <w:rPr>
           <w:rtl/>
@@ -882,20 +828,14 @@
         </w:rPr>
         <w:t xml:space="preserve">, </w:t>
       </w:r>
-      <w:hyperlink r:id="rId22">
-        <w:r>
-          <w:rPr>
-            <w:rtl/>
-            <w:cs/>
-            <w:lang w:val="ar_AE" w:bidi="ar_AE"/>
-          </w:rPr>
-          <w:rPr>
-            <w:color w:val="0000EE"/>
-            <w:u w:val="single"/>
-          </w:rPr>
-          <w:t>16</w:t>
-        </w:r>
-      </w:hyperlink>
+      <w:r>
+        <w:rPr>
+          <w:rtl/>
+          <w:cs/>
+          <w:lang w:val="ar_AE" w:bidi="ar_AE"/>
+        </w:rPr>
+        <w:t>16</w:t>
+      </w:r>
       <w:r>
         <w:rPr>
           <w:rtl/>
@@ -904,20 +844,14 @@
         </w:rPr>
         <w:t>). وتوقفوا عن طاعة الله (</w:t>
       </w:r>
-      <w:hyperlink r:id="rId23">
-        <w:r>
-          <w:rPr>
-            <w:rtl/>
-            <w:cs/>
-            <w:lang w:val="ar_AE" w:bidi="ar_AE"/>
-          </w:rPr>
-          <w:rPr>
-            <w:color w:val="0000EE"/>
-            <w:u w:val="single"/>
-          </w:rPr>
-          <w:t>12:3</w:t>
-        </w:r>
-      </w:hyperlink>
+      <w:r>
+        <w:rPr>
+          <w:rtl/>
+          <w:cs/>
+          <w:lang w:val="ar_AE" w:bidi="ar_AE"/>
+        </w:rPr>
+        <w:t>12:3</w:t>
+      </w:r>
       <w:r>
         <w:rPr>
           <w:rtl/>
@@ -926,20 +860,14 @@
         </w:rPr>
         <w:t xml:space="preserve">; </w:t>
       </w:r>
-      <w:hyperlink r:id="rId24">
-        <w:r>
-          <w:rPr>
-            <w:rtl/>
-            <w:cs/>
-            <w:lang w:val="ar_AE" w:bidi="ar_AE"/>
-          </w:rPr>
-          <w:rPr>
-            <w:color w:val="0000EE"/>
-            <w:u w:val="single"/>
-          </w:rPr>
-          <w:t>14:4</w:t>
-        </w:r>
-      </w:hyperlink>
+      <w:r>
+        <w:rPr>
+          <w:rtl/>
+          <w:cs/>
+          <w:lang w:val="ar_AE" w:bidi="ar_AE"/>
+        </w:rPr>
+        <w:t>14:4</w:t>
+      </w:r>
       <w:r>
         <w:rPr>
           <w:rtl/>
@@ -948,20 +876,14 @@
         </w:rPr>
         <w:t xml:space="preserve">; </w:t>
       </w:r>
-      <w:hyperlink r:id="rId25">
-        <w:r>
-          <w:rPr>
-            <w:rtl/>
-            <w:cs/>
-            <w:lang w:val="ar_AE" w:bidi="ar_AE"/>
-          </w:rPr>
-          <w:rPr>
-            <w:color w:val="0000EE"/>
-            <w:u w:val="single"/>
-          </w:rPr>
-          <w:t>15:4</w:t>
-        </w:r>
-      </w:hyperlink>
+      <w:r>
+        <w:rPr>
+          <w:rtl/>
+          <w:cs/>
+          <w:lang w:val="ar_AE" w:bidi="ar_AE"/>
+        </w:rPr>
+        <w:t>15:4</w:t>
+      </w:r>
       <w:r>
         <w:rPr>
           <w:rtl/>
@@ -970,20 +892,14 @@
         </w:rPr>
         <w:t xml:space="preserve">, </w:t>
       </w:r>
-      <w:hyperlink r:id="rId26">
-        <w:r>
-          <w:rPr>
-            <w:rtl/>
-            <w:cs/>
-            <w:lang w:val="ar_AE" w:bidi="ar_AE"/>
-          </w:rPr>
-          <w:rPr>
-            <w:color w:val="0000EE"/>
-            <w:u w:val="single"/>
-          </w:rPr>
-          <w:t>35</w:t>
-        </w:r>
-      </w:hyperlink>
+      <w:r>
+        <w:rPr>
+          <w:rtl/>
+          <w:cs/>
+          <w:lang w:val="ar_AE" w:bidi="ar_AE"/>
+        </w:rPr>
+        <w:t>35</w:t>
+      </w:r>
       <w:r>
         <w:rPr>
           <w:rtl/>
@@ -992,20 +908,14 @@
         </w:rPr>
         <w:t xml:space="preserve">; </w:t>
       </w:r>
-      <w:hyperlink r:id="rId27">
-        <w:r>
-          <w:rPr>
-            <w:rtl/>
-            <w:cs/>
-            <w:lang w:val="ar_AE" w:bidi="ar_AE"/>
-          </w:rPr>
-          <w:rPr>
-            <w:color w:val="0000EE"/>
-            <w:u w:val="single"/>
-          </w:rPr>
-          <w:t>17:9–11</w:t>
-        </w:r>
-      </w:hyperlink>
+      <w:r>
+        <w:rPr>
+          <w:rtl/>
+          <w:cs/>
+          <w:lang w:val="ar_AE" w:bidi="ar_AE"/>
+        </w:rPr>
+        <w:t>17:9–11</w:t>
+      </w:r>
       <w:r>
         <w:rPr>
           <w:rtl/>
@@ -1014,20 +924,14 @@
         </w:rPr>
         <w:t xml:space="preserve">; </w:t>
       </w:r>
-      <w:hyperlink r:id="rId28">
-        <w:r>
-          <w:rPr>
-            <w:rtl/>
-            <w:cs/>
-            <w:lang w:val="ar_AE" w:bidi="ar_AE"/>
-          </w:rPr>
-          <w:rPr>
-            <w:color w:val="0000EE"/>
-            <w:u w:val="single"/>
-          </w:rPr>
-          <w:t>18:4</w:t>
-        </w:r>
-      </w:hyperlink>
+      <w:r>
+        <w:rPr>
+          <w:rtl/>
+          <w:cs/>
+          <w:lang w:val="ar_AE" w:bidi="ar_AE"/>
+        </w:rPr>
+        <w:t>18:4</w:t>
+      </w:r>
       <w:r>
         <w:rPr>
           <w:rtl/>
@@ -1036,20 +940,14 @@
         </w:rPr>
         <w:t xml:space="preserve">; </w:t>
       </w:r>
-      <w:hyperlink r:id="rId29">
-        <w:r>
-          <w:rPr>
-            <w:rtl/>
-            <w:cs/>
-            <w:lang w:val="ar_AE" w:bidi="ar_AE"/>
-          </w:rPr>
-          <w:rPr>
-            <w:color w:val="0000EE"/>
-            <w:u w:val="single"/>
-          </w:rPr>
-          <w:t>22:17</w:t>
-        </w:r>
-      </w:hyperlink>
+      <w:r>
+        <w:rPr>
+          <w:rtl/>
+          <w:cs/>
+          <w:lang w:val="ar_AE" w:bidi="ar_AE"/>
+        </w:rPr>
+        <w:t>22:17</w:t>
+      </w:r>
       <w:r>
         <w:rPr>
           <w:rtl/>
@@ -1058,20 +956,14 @@
         </w:rPr>
         <w:t>). كما شارك بني إسرائيل في الممارسات الدينية التي بدأها يربعام الأول (</w:t>
       </w:r>
-      <w:hyperlink r:id="rId30">
-        <w:r>
-          <w:rPr>
-            <w:rtl/>
-            <w:cs/>
-            <w:lang w:val="ar_AE" w:bidi="ar_AE"/>
-          </w:rPr>
-          <w:rPr>
-            <w:color w:val="0000EE"/>
-            <w:u w:val="single"/>
-          </w:rPr>
-          <w:t>10:28–31</w:t>
-        </w:r>
-      </w:hyperlink>
+      <w:r>
+        <w:rPr>
+          <w:rtl/>
+          <w:cs/>
+          <w:lang w:val="ar_AE" w:bidi="ar_AE"/>
+        </w:rPr>
+        <w:t>10:28–31</w:t>
+      </w:r>
       <w:r>
         <w:rPr>
           <w:rtl/>
@@ -1080,20 +972,14 @@
         </w:rPr>
         <w:t xml:space="preserve">; </w:t>
       </w:r>
-      <w:hyperlink r:id="rId31">
-        <w:r>
-          <w:rPr>
-            <w:rtl/>
-            <w:cs/>
-            <w:lang w:val="ar_AE" w:bidi="ar_AE"/>
-          </w:rPr>
-          <w:rPr>
-            <w:color w:val="0000EE"/>
-            <w:u w:val="single"/>
-          </w:rPr>
-          <w:t>17:21–22</w:t>
-        </w:r>
-      </w:hyperlink>
+      <w:r>
+        <w:rPr>
+          <w:rtl/>
+          <w:cs/>
+          <w:lang w:val="ar_AE" w:bidi="ar_AE"/>
+        </w:rPr>
+        <w:t>17:21–22</w:t>
+      </w:r>
       <w:r>
         <w:rPr>
           <w:rtl/>
@@ -1102,20 +988,14 @@
         </w:rPr>
         <w:t>)، وعبدوا في المزارات الوثنية (أماكن للعبادة الوثنية) (</w:t>
       </w:r>
-      <w:hyperlink r:id="rId23">
-        <w:r>
-          <w:rPr>
-            <w:rtl/>
-            <w:cs/>
-            <w:lang w:val="ar_AE" w:bidi="ar_AE"/>
-          </w:rPr>
-          <w:rPr>
-            <w:color w:val="0000EE"/>
-            <w:u w:val="single"/>
-          </w:rPr>
-          <w:t>12:3</w:t>
-        </w:r>
-      </w:hyperlink>
+      <w:r>
+        <w:rPr>
+          <w:rtl/>
+          <w:cs/>
+          <w:lang w:val="ar_AE" w:bidi="ar_AE"/>
+        </w:rPr>
+        <w:t>12:3</w:t>
+      </w:r>
       <w:r>
         <w:rPr>
           <w:rtl/>
@@ -1124,20 +1004,14 @@
         </w:rPr>
         <w:t xml:space="preserve">; </w:t>
       </w:r>
-      <w:hyperlink r:id="rId24">
-        <w:r>
-          <w:rPr>
-            <w:rtl/>
-            <w:cs/>
-            <w:lang w:val="ar_AE" w:bidi="ar_AE"/>
-          </w:rPr>
-          <w:rPr>
-            <w:color w:val="0000EE"/>
-            <w:u w:val="single"/>
-          </w:rPr>
-          <w:t>14:4</w:t>
-        </w:r>
-      </w:hyperlink>
+      <w:r>
+        <w:rPr>
+          <w:rtl/>
+          <w:cs/>
+          <w:lang w:val="ar_AE" w:bidi="ar_AE"/>
+        </w:rPr>
+        <w:t>14:4</w:t>
+      </w:r>
       <w:r>
         <w:rPr>
           <w:rtl/>
@@ -1146,20 +1020,14 @@
         </w:rPr>
         <w:t xml:space="preserve">; </w:t>
       </w:r>
-      <w:hyperlink r:id="rId25">
-        <w:r>
-          <w:rPr>
-            <w:rtl/>
-            <w:cs/>
-            <w:lang w:val="ar_AE" w:bidi="ar_AE"/>
-          </w:rPr>
-          <w:rPr>
-            <w:color w:val="0000EE"/>
-            <w:u w:val="single"/>
-          </w:rPr>
-          <w:t>15:4</w:t>
-        </w:r>
-      </w:hyperlink>
+      <w:r>
+        <w:rPr>
+          <w:rtl/>
+          <w:cs/>
+          <w:lang w:val="ar_AE" w:bidi="ar_AE"/>
+        </w:rPr>
+        <w:t>15:4</w:t>
+      </w:r>
       <w:r>
         <w:rPr>
           <w:rtl/>
@@ -1168,20 +1036,14 @@
         </w:rPr>
         <w:t xml:space="preserve">, </w:t>
       </w:r>
-      <w:hyperlink r:id="rId26">
-        <w:r>
-          <w:rPr>
-            <w:rtl/>
-            <w:cs/>
-            <w:lang w:val="ar_AE" w:bidi="ar_AE"/>
-          </w:rPr>
-          <w:rPr>
-            <w:color w:val="0000EE"/>
-            <w:u w:val="single"/>
-          </w:rPr>
-          <w:t>35</w:t>
-        </w:r>
-      </w:hyperlink>
+      <w:r>
+        <w:rPr>
+          <w:rtl/>
+          <w:cs/>
+          <w:lang w:val="ar_AE" w:bidi="ar_AE"/>
+        </w:rPr>
+        <w:t>35</w:t>
+      </w:r>
       <w:r>
         <w:rPr>
           <w:rtl/>
@@ -1190,20 +1052,14 @@
         </w:rPr>
         <w:t xml:space="preserve">; </w:t>
       </w:r>
-      <w:hyperlink r:id="rId28">
-        <w:r>
-          <w:rPr>
-            <w:rtl/>
-            <w:cs/>
-            <w:lang w:val="ar_AE" w:bidi="ar_AE"/>
-          </w:rPr>
-          <w:rPr>
-            <w:color w:val="0000EE"/>
-            <w:u w:val="single"/>
-          </w:rPr>
-          <w:t>18:4</w:t>
-        </w:r>
-      </w:hyperlink>
+      <w:r>
+        <w:rPr>
+          <w:rtl/>
+          <w:cs/>
+          <w:lang w:val="ar_AE" w:bidi="ar_AE"/>
+        </w:rPr>
+        <w:t>18:4</w:t>
+      </w:r>
       <w:r>
         <w:rPr>
           <w:rtl/>
@@ -1232,20 +1088,14 @@
         </w:rPr>
         <w:t>خلال هذه الفترة، تصف الكتابات المقدسة أحيانًا شعب الله بشكل إيجابي. فقد احتفل شعب يهوذا عندما أزالوا الملكة عثليا وأصبح يواش ملكًا (</w:t>
       </w:r>
-      <w:hyperlink r:id="rId32">
-        <w:r>
-          <w:rPr>
-            <w:rtl/>
-            <w:cs/>
-            <w:lang w:val="ar_AE" w:bidi="ar_AE"/>
-          </w:rPr>
-          <w:rPr>
-            <w:color w:val="0000EE"/>
-            <w:u w:val="single"/>
-          </w:rPr>
-          <w:t>2 ملوك 11:12</w:t>
-        </w:r>
-      </w:hyperlink>
+      <w:r>
+        <w:rPr>
+          <w:rtl/>
+          <w:cs/>
+          <w:lang w:val="ar_AE" w:bidi="ar_AE"/>
+        </w:rPr>
+        <w:t>2 ملوك 11:12</w:t>
+      </w:r>
       <w:r>
         <w:rPr>
           <w:rtl/>
@@ -1254,20 +1104,14 @@
         </w:rPr>
         <w:t xml:space="preserve">, </w:t>
       </w:r>
-      <w:hyperlink r:id="rId33">
-        <w:r>
-          <w:rPr>
-            <w:rtl/>
-            <w:cs/>
-            <w:lang w:val="ar_AE" w:bidi="ar_AE"/>
-          </w:rPr>
-          <w:rPr>
-            <w:color w:val="0000EE"/>
-            <w:u w:val="single"/>
-          </w:rPr>
-          <w:t>18–20</w:t>
-        </w:r>
-      </w:hyperlink>
+      <w:r>
+        <w:rPr>
+          <w:rtl/>
+          <w:cs/>
+          <w:lang w:val="ar_AE" w:bidi="ar_AE"/>
+        </w:rPr>
+        <w:t>18–20</w:t>
+      </w:r>
       <w:r>
         <w:rPr>
           <w:rtl/>
@@ -1276,20 +1120,14 @@
         </w:rPr>
         <w:t>). وأحيانًا ساهم الشعب في اختيار ملوك جدد أو اتبعوا قادة صالحين (</w:t>
       </w:r>
-      <w:hyperlink r:id="rId34">
-        <w:r>
-          <w:rPr>
-            <w:rtl/>
-            <w:cs/>
-            <w:lang w:val="ar_AE" w:bidi="ar_AE"/>
-          </w:rPr>
-          <w:rPr>
-            <w:color w:val="0000EE"/>
-            <w:u w:val="single"/>
-          </w:rPr>
-          <w:t>14:21</w:t>
-        </w:r>
-      </w:hyperlink>
+      <w:r>
+        <w:rPr>
+          <w:rtl/>
+          <w:cs/>
+          <w:lang w:val="ar_AE" w:bidi="ar_AE"/>
+        </w:rPr>
+        <w:t>14:21</w:t>
+      </w:r>
       <w:r>
         <w:rPr>
           <w:rtl/>
@@ -1298,20 +1136,14 @@
         </w:rPr>
         <w:t xml:space="preserve">; </w:t>
       </w:r>
-      <w:hyperlink r:id="rId35">
-        <w:r>
-          <w:rPr>
-            <w:rtl/>
-            <w:cs/>
-            <w:lang w:val="ar_AE" w:bidi="ar_AE"/>
-          </w:rPr>
-          <w:rPr>
-            <w:color w:val="0000EE"/>
-            <w:u w:val="single"/>
-          </w:rPr>
-          <w:t>23:30</w:t>
-        </w:r>
-      </w:hyperlink>
+      <w:r>
+        <w:rPr>
+          <w:rtl/>
+          <w:cs/>
+          <w:lang w:val="ar_AE" w:bidi="ar_AE"/>
+        </w:rPr>
+        <w:t>23:30</w:t>
+      </w:r>
       <w:r>
         <w:rPr>
           <w:rtl/>
@@ -1320,20 +1152,14 @@
         </w:rPr>
         <w:t xml:space="preserve">; </w:t>
       </w:r>
-      <w:hyperlink r:id="rId36">
-        <w:r>
-          <w:rPr>
-            <w:rtl/>
-            <w:cs/>
-            <w:lang w:val="ar_AE" w:bidi="ar_AE"/>
-          </w:rPr>
-          <w:rPr>
-            <w:color w:val="0000EE"/>
-            <w:u w:val="single"/>
-          </w:rPr>
-          <w:t>11:17</w:t>
-        </w:r>
-      </w:hyperlink>
+      <w:r>
+        <w:rPr>
+          <w:rtl/>
+          <w:cs/>
+          <w:lang w:val="ar_AE" w:bidi="ar_AE"/>
+        </w:rPr>
+        <w:t>11:17</w:t>
+      </w:r>
       <w:r>
         <w:rPr>
           <w:rtl/>
@@ -1342,20 +1168,14 @@
         </w:rPr>
         <w:t xml:space="preserve">; </w:t>
       </w:r>
-      <w:hyperlink r:id="rId37">
-        <w:r>
-          <w:rPr>
-            <w:rtl/>
-            <w:cs/>
-            <w:lang w:val="ar_AE" w:bidi="ar_AE"/>
-          </w:rPr>
-          <w:rPr>
-            <w:color w:val="0000EE"/>
-            <w:u w:val="single"/>
-          </w:rPr>
-          <w:t>18:36</w:t>
-        </w:r>
-      </w:hyperlink>
+      <w:r>
+        <w:rPr>
+          <w:rtl/>
+          <w:cs/>
+          <w:lang w:val="ar_AE" w:bidi="ar_AE"/>
+        </w:rPr>
+        <w:t>18:36</w:t>
+      </w:r>
       <w:r>
         <w:rPr>
           <w:rtl/>
@@ -1364,20 +1184,14 @@
         </w:rPr>
         <w:t xml:space="preserve">; </w:t>
       </w:r>
-      <w:hyperlink r:id="rId38">
-        <w:r>
-          <w:rPr>
-            <w:rtl/>
-            <w:cs/>
-            <w:lang w:val="ar_AE" w:bidi="ar_AE"/>
-          </w:rPr>
-          <w:rPr>
-            <w:color w:val="0000EE"/>
-            <w:u w:val="single"/>
-          </w:rPr>
-          <w:t>23:1–3</w:t>
-        </w:r>
-      </w:hyperlink>
+      <w:r>
+        <w:rPr>
+          <w:rtl/>
+          <w:cs/>
+          <w:lang w:val="ar_AE" w:bidi="ar_AE"/>
+        </w:rPr>
+        <w:t>23:1–3</w:t>
+      </w:r>
       <w:r>
         <w:rPr>
           <w:rtl/>
@@ -1386,20 +1200,14 @@
         </w:rPr>
         <w:t xml:space="preserve">, </w:t>
       </w:r>
-      <w:hyperlink r:id="rId39">
-        <w:r>
-          <w:rPr>
-            <w:rtl/>
-            <w:cs/>
-            <w:lang w:val="ar_AE" w:bidi="ar_AE"/>
-          </w:rPr>
-          <w:rPr>
-            <w:color w:val="0000EE"/>
-            <w:u w:val="single"/>
-          </w:rPr>
-          <w:t>21–23</w:t>
-        </w:r>
-      </w:hyperlink>
+      <w:r>
+        <w:rPr>
+          <w:rtl/>
+          <w:cs/>
+          <w:lang w:val="ar_AE" w:bidi="ar_AE"/>
+        </w:rPr>
+        <w:t>21–23</w:t>
+      </w:r>
       <w:r>
         <w:rPr>
           <w:rtl/>
@@ -1428,20 +1236,14 @@
         </w:rPr>
         <w:t>استمر الله في تحذير شعبه عن طريق أنبيائه (</w:t>
       </w:r>
-      <w:hyperlink r:id="rId40">
-        <w:r>
-          <w:rPr>
-            <w:rtl/>
-            <w:cs/>
-            <w:lang w:val="ar_AE" w:bidi="ar_AE"/>
-          </w:rPr>
-          <w:rPr>
-            <w:color w:val="0000EE"/>
-            <w:u w:val="single"/>
-          </w:rPr>
-          <w:t>2 ملوك 17:13</w:t>
-        </w:r>
-      </w:hyperlink>
+      <w:r>
+        <w:rPr>
+          <w:rtl/>
+          <w:cs/>
+          <w:lang w:val="ar_AE" w:bidi="ar_AE"/>
+        </w:rPr>
+        <w:t>2 ملوك 17:13</w:t>
+      </w:r>
       <w:r>
         <w:rPr>
           <w:rtl/>
@@ -1450,20 +1252,14 @@
         </w:rPr>
         <w:t>). ومع ذلك، استمر شعب المملكتين في التمرد ضد الله (</w:t>
       </w:r>
-      <w:hyperlink r:id="rId41">
-        <w:r>
-          <w:rPr>
-            <w:rtl/>
-            <w:cs/>
-            <w:lang w:val="ar_AE" w:bidi="ar_AE"/>
-          </w:rPr>
-          <w:rPr>
-            <w:color w:val="0000EE"/>
-            <w:u w:val="single"/>
-          </w:rPr>
-          <w:t>17:14–19</w:t>
-        </w:r>
-      </w:hyperlink>
+      <w:r>
+        <w:rPr>
+          <w:rtl/>
+          <w:cs/>
+          <w:lang w:val="ar_AE" w:bidi="ar_AE"/>
+        </w:rPr>
+        <w:t>17:14–19</w:t>
+      </w:r>
       <w:r>
         <w:rPr>
           <w:rtl/>
@@ -1472,20 +1268,14 @@
         </w:rPr>
         <w:t xml:space="preserve">, </w:t>
       </w:r>
-      <w:hyperlink r:id="rId19">
-        <w:r>
-          <w:rPr>
-            <w:rtl/>
-            <w:cs/>
-            <w:lang w:val="ar_AE" w:bidi="ar_AE"/>
-          </w:rPr>
-          <w:rPr>
-            <w:color w:val="0000EE"/>
-            <w:u w:val="single"/>
-          </w:rPr>
-          <w:t>22</w:t>
-        </w:r>
-      </w:hyperlink>
+      <w:r>
+        <w:rPr>
+          <w:rtl/>
+          <w:cs/>
+          <w:lang w:val="ar_AE" w:bidi="ar_AE"/>
+        </w:rPr>
+        <w:t>22</w:t>
+      </w:r>
       <w:r>
         <w:rPr>
           <w:rtl/>
@@ -1494,20 +1284,14 @@
         </w:rPr>
         <w:t>). ونتيجة لذلك، أدانهم الله كما وعد (</w:t>
       </w:r>
-      <w:hyperlink r:id="rId42">
-        <w:r>
-          <w:rPr>
-            <w:rtl/>
-            <w:cs/>
-            <w:lang w:val="ar_AE" w:bidi="ar_AE"/>
-          </w:rPr>
-          <w:rPr>
-            <w:color w:val="0000EE"/>
-            <w:u w:val="single"/>
-          </w:rPr>
-          <w:t>17:22–23</w:t>
-        </w:r>
-      </w:hyperlink>
+      <w:r>
+        <w:rPr>
+          <w:rtl/>
+          <w:cs/>
+          <w:lang w:val="ar_AE" w:bidi="ar_AE"/>
+        </w:rPr>
+        <w:t>17:22–23</w:t>
+      </w:r>
       <w:r>
         <w:rPr>
           <w:rtl/>
@@ -1516,20 +1300,14 @@
         </w:rPr>
         <w:t xml:space="preserve">; </w:t>
       </w:r>
-      <w:hyperlink r:id="rId43">
-        <w:r>
-          <w:rPr>
-            <w:rtl/>
-            <w:cs/>
-            <w:lang w:val="ar_AE" w:bidi="ar_AE"/>
-          </w:rPr>
-          <w:rPr>
-            <w:color w:val="0000EE"/>
-            <w:u w:val="single"/>
-          </w:rPr>
-          <w:t>21:10–15</w:t>
-        </w:r>
-      </w:hyperlink>
+      <w:r>
+        <w:rPr>
+          <w:rtl/>
+          <w:cs/>
+          <w:lang w:val="ar_AE" w:bidi="ar_AE"/>
+        </w:rPr>
+        <w:t>21:10–15</w:t>
+      </w:r>
       <w:r>
         <w:rPr>
           <w:rtl/>
@@ -1538,20 +1316,14 @@
         </w:rPr>
         <w:t xml:space="preserve">; </w:t>
       </w:r>
-      <w:hyperlink r:id="rId29">
-        <w:r>
-          <w:rPr>
-            <w:rtl/>
-            <w:cs/>
-            <w:lang w:val="ar_AE" w:bidi="ar_AE"/>
-          </w:rPr>
-          <w:rPr>
-            <w:color w:val="0000EE"/>
-            <w:u w:val="single"/>
-          </w:rPr>
-          <w:t>22:17</w:t>
-        </w:r>
-      </w:hyperlink>
+      <w:r>
+        <w:rPr>
+          <w:rtl/>
+          <w:cs/>
+          <w:lang w:val="ar_AE" w:bidi="ar_AE"/>
+        </w:rPr>
+        <w:t>22:17</w:t>
+      </w:r>
       <w:r>
         <w:rPr>
           <w:rtl/>
@@ -1560,20 +1332,14 @@
         </w:rPr>
         <w:t xml:space="preserve">; </w:t>
       </w:r>
-      <w:hyperlink r:id="rId44">
-        <w:r>
-          <w:rPr>
-            <w:rtl/>
-            <w:cs/>
-            <w:lang w:val="ar_AE" w:bidi="ar_AE"/>
-          </w:rPr>
-          <w:rPr>
-            <w:color w:val="0000EE"/>
-            <w:u w:val="single"/>
-          </w:rPr>
-          <w:t>23:26–27</w:t>
-        </w:r>
-      </w:hyperlink>
+      <w:r>
+        <w:rPr>
+          <w:rtl/>
+          <w:cs/>
+          <w:lang w:val="ar_AE" w:bidi="ar_AE"/>
+        </w:rPr>
+        <w:t>23:26–27</w:t>
+      </w:r>
       <w:r>
         <w:rPr>
           <w:rtl/>
@@ -1582,20 +1348,14 @@
         </w:rPr>
         <w:t xml:space="preserve">; </w:t>
       </w:r>
-      <w:hyperlink r:id="rId45">
-        <w:r>
-          <w:rPr>
-            <w:rtl/>
-            <w:cs/>
-            <w:lang w:val="ar_AE" w:bidi="ar_AE"/>
-          </w:rPr>
-          <w:rPr>
-            <w:color w:val="0000EE"/>
-            <w:u w:val="single"/>
-          </w:rPr>
-          <w:t>24:20</w:t>
-        </w:r>
-      </w:hyperlink>
+      <w:r>
+        <w:rPr>
+          <w:rtl/>
+          <w:cs/>
+          <w:lang w:val="ar_AE" w:bidi="ar_AE"/>
+        </w:rPr>
+        <w:t>24:20</w:t>
+      </w:r>
       <w:r>
         <w:rPr>
           <w:rtl/>
@@ -1604,20 +1364,14 @@
         </w:rPr>
         <w:t xml:space="preserve">; </w:t>
       </w:r>
-      <w:hyperlink r:id="rId46">
-        <w:r>
-          <w:rPr>
-            <w:rtl/>
-            <w:cs/>
-            <w:lang w:val="ar_AE" w:bidi="ar_AE"/>
-          </w:rPr>
-          <w:rPr>
-            <w:color w:val="0000EE"/>
-            <w:u w:val="single"/>
-          </w:rPr>
-          <w:t>25:21</w:t>
-        </w:r>
-      </w:hyperlink>
+      <w:r>
+        <w:rPr>
+          <w:rtl/>
+          <w:cs/>
+          <w:lang w:val="ar_AE" w:bidi="ar_AE"/>
+        </w:rPr>
+        <w:t>25:21</w:t>
+      </w:r>
       <w:r>
         <w:rPr>
           <w:rtl/>
@@ -1626,20 +1380,14 @@
         </w:rPr>
         <w:t>). لقد تصرّف الله وفقًا لشروط عهده الخاص معهم (</w:t>
       </w:r>
-      <w:hyperlink r:id="rId47">
-        <w:r>
-          <w:rPr>
-            <w:rtl/>
-            <w:cs/>
-            <w:lang w:val="ar_AE" w:bidi="ar_AE"/>
-          </w:rPr>
-          <w:rPr>
-            <w:color w:val="0000EE"/>
-            <w:u w:val="single"/>
-          </w:rPr>
-          <w:t>لاويين 26:27–39</w:t>
-        </w:r>
-      </w:hyperlink>
+      <w:r>
+        <w:rPr>
+          <w:rtl/>
+          <w:cs/>
+          <w:lang w:val="ar_AE" w:bidi="ar_AE"/>
+        </w:rPr>
+        <w:t>لاويين 26:27–39</w:t>
+      </w:r>
       <w:r>
         <w:rPr>
           <w:rtl/>
@@ -1668,20 +1416,14 @@
         </w:rPr>
         <w:t xml:space="preserve">ومع ذلك، استمر الله في محبته لشعبه ورغب في استردادهم (انظر </w:t>
       </w:r>
-      <w:hyperlink r:id="rId48">
-        <w:r>
-          <w:rPr>
-            <w:rtl/>
-            <w:cs/>
-            <w:lang w:val="ar_AE" w:bidi="ar_AE"/>
-          </w:rPr>
-          <w:rPr>
-            <w:color w:val="0000EE"/>
-            <w:u w:val="single"/>
-          </w:rPr>
-          <w:t>هوشع 11:1–11</w:t>
-        </w:r>
-      </w:hyperlink>
+      <w:r>
+        <w:rPr>
+          <w:rtl/>
+          <w:cs/>
+          <w:lang w:val="ar_AE" w:bidi="ar_AE"/>
+        </w:rPr>
+        <w:t>هوشع 11:1–11</w:t>
+      </w:r>
       <w:r>
         <w:rPr>
           <w:rtl/>
@@ -1690,20 +1432,14 @@
         </w:rPr>
         <w:t>). فقد كان الله يهتم بشعبه دائمًا. لقد أنقذهم من سنحاريب (</w:t>
       </w:r>
-      <w:hyperlink r:id="rId49">
-        <w:r>
-          <w:rPr>
-            <w:rtl/>
-            <w:cs/>
-            <w:lang w:val="ar_AE" w:bidi="ar_AE"/>
-          </w:rPr>
-          <w:rPr>
-            <w:color w:val="0000EE"/>
-            <w:u w:val="single"/>
-          </w:rPr>
-          <w:t>2 ملوك 18:17–19:37</w:t>
-        </w:r>
-      </w:hyperlink>
+      <w:r>
+        <w:rPr>
+          <w:rtl/>
+          <w:cs/>
+          <w:lang w:val="ar_AE" w:bidi="ar_AE"/>
+        </w:rPr>
+        <w:t>2 ملوك 18:17–19:37</w:t>
+      </w:r>
       <w:r>
         <w:rPr>
           <w:rtl/>
@@ -1712,20 +1448,14 @@
         </w:rPr>
         <w:t>). ووعد بأن بقيّة صغيرة منهم ستزدهر مرة أخرى في الأرض (</w:t>
       </w:r>
-      <w:hyperlink r:id="rId50">
-        <w:r>
-          <w:rPr>
-            <w:rtl/>
-            <w:cs/>
-            <w:lang w:val="ar_AE" w:bidi="ar_AE"/>
-          </w:rPr>
-          <w:rPr>
-            <w:color w:val="0000EE"/>
-            <w:u w:val="single"/>
-          </w:rPr>
-          <w:t>19:30–31</w:t>
-        </w:r>
-      </w:hyperlink>
+      <w:r>
+        <w:rPr>
+          <w:rtl/>
+          <w:cs/>
+          <w:lang w:val="ar_AE" w:bidi="ar_AE"/>
+        </w:rPr>
+        <w:t>19:30–31</w:t>
+      </w:r>
       <w:r>
         <w:rPr>
           <w:rtl/>
@@ -1734,20 +1464,14 @@
         </w:rPr>
         <w:t>). وقد يكون حسن المعاملة التي تلقاها الملك يهوياكين في بابل قد جدد الأمل لدى الشعب التائب (</w:t>
       </w:r>
-      <w:hyperlink r:id="rId51">
-        <w:r>
-          <w:rPr>
-            <w:rtl/>
-            <w:cs/>
-            <w:lang w:val="ar_AE" w:bidi="ar_AE"/>
-          </w:rPr>
-          <w:rPr>
-            <w:color w:val="0000EE"/>
-            <w:u w:val="single"/>
-          </w:rPr>
-          <w:t>25:27–30</w:t>
-        </w:r>
-      </w:hyperlink>
+      <w:r>
+        <w:rPr>
+          <w:rtl/>
+          <w:cs/>
+          <w:lang w:val="ar_AE" w:bidi="ar_AE"/>
+        </w:rPr>
+        <w:t>25:27–30</w:t>
+      </w:r>
       <w:r>
         <w:rPr>
           <w:rtl/>
@@ -1776,20 +1500,14 @@
         </w:rPr>
         <w:t>لقد وعد الله باسترداد شعبه من السبي، وأن يمنحهم شركة معه في الأرض من جديد. كما وعد أن يملك عليهم من خلال ملكه المختار، الذي هو من نسل داود (</w:t>
       </w:r>
-      <w:hyperlink r:id="rId52">
-        <w:r>
-          <w:rPr>
-            <w:rtl/>
-            <w:cs/>
-            <w:lang w:val="ar_AE" w:bidi="ar_AE"/>
-          </w:rPr>
-          <w:rPr>
-            <w:color w:val="0000EE"/>
-            <w:u w:val="single"/>
-          </w:rPr>
-          <w:t>إرميا 23:3–6</w:t>
-        </w:r>
-      </w:hyperlink>
+      <w:r>
+        <w:rPr>
+          <w:rtl/>
+          <w:cs/>
+          <w:lang w:val="ar_AE" w:bidi="ar_AE"/>
+        </w:rPr>
+        <w:t>إرميا 23:3–6</w:t>
+      </w:r>
       <w:r>
         <w:rPr>
           <w:rtl/>
@@ -1798,20 +1516,14 @@
         </w:rPr>
         <w:t xml:space="preserve">; انظر أيضًا </w:t>
       </w:r>
-      <w:hyperlink r:id="rId53">
-        <w:r>
-          <w:rPr>
-            <w:rtl/>
-            <w:cs/>
-            <w:lang w:val="ar_AE" w:bidi="ar_AE"/>
-          </w:rPr>
-          <w:rPr>
-            <w:color w:val="0000EE"/>
-            <w:u w:val="single"/>
-          </w:rPr>
-          <w:t>إشعياء 11</w:t>
-        </w:r>
-      </w:hyperlink>
+      <w:r>
+        <w:rPr>
+          <w:rtl/>
+          <w:cs/>
+          <w:lang w:val="ar_AE" w:bidi="ar_AE"/>
+        </w:rPr>
+        <w:t>إشعياء 11</w:t>
+      </w:r>
       <w:r>
         <w:rPr>
           <w:rtl/>
@@ -1820,20 +1532,14 @@
         </w:rPr>
         <w:t xml:space="preserve">; </w:t>
       </w:r>
-      <w:hyperlink r:id="rId54">
-        <w:r>
-          <w:rPr>
-            <w:rtl/>
-            <w:cs/>
-            <w:lang w:val="ar_AE" w:bidi="ar_AE"/>
-          </w:rPr>
-          <w:rPr>
-            <w:color w:val="0000EE"/>
-            <w:u w:val="single"/>
-          </w:rPr>
-          <w:t>رومية 11:5–36</w:t>
-        </w:r>
-      </w:hyperlink>
+      <w:r>
+        <w:rPr>
+          <w:rtl/>
+          <w:cs/>
+          <w:lang w:val="ar_AE" w:bidi="ar_AE"/>
+        </w:rPr>
+        <w:t>رومية 11:5–36</w:t>
+      </w:r>
       <w:r>
         <w:rPr>
           <w:rtl/>
@@ -1875,20 +1581,14 @@
           <w:lang w:val="ar_AE" w:bidi="ar_AE"/>
         </w:rPr>
       </w:r>
-      <w:hyperlink r:id="rId47">
-        <w:r>
-          <w:rPr>
-            <w:rtl/>
-            <w:cs/>
-            <w:lang w:val="ar_AE" w:bidi="ar_AE"/>
-          </w:rPr>
-          <w:rPr>
-            <w:color w:val="0000EE"/>
-            <w:u w:val="single"/>
-          </w:rPr>
-          <w:t>لاويين 26:27–39</w:t>
-        </w:r>
-      </w:hyperlink>
+      <w:r>
+        <w:rPr>
+          <w:rtl/>
+          <w:cs/>
+          <w:lang w:val="ar_AE" w:bidi="ar_AE"/>
+        </w:rPr>
+        <w:t>لاويين 26:27–39</w:t>
+      </w:r>
       <w:r>
         <w:rPr>
           <w:rtl/>
@@ -1897,20 +1597,14 @@
         </w:rPr>
         <w:t xml:space="preserve">; </w:t>
       </w:r>
-      <w:hyperlink r:id="rId55">
-        <w:r>
-          <w:rPr>
-            <w:rtl/>
-            <w:cs/>
-            <w:lang w:val="ar_AE" w:bidi="ar_AE"/>
-          </w:rPr>
-          <w:rPr>
-            <w:color w:val="0000EE"/>
-            <w:u w:val="single"/>
-          </w:rPr>
-          <w:t>2 ملوك 17:7–23</w:t>
-        </w:r>
-      </w:hyperlink>
+      <w:r>
+        <w:rPr>
+          <w:rtl/>
+          <w:cs/>
+          <w:lang w:val="ar_AE" w:bidi="ar_AE"/>
+        </w:rPr>
+        <w:t>2 ملوك 17:7–23</w:t>
+      </w:r>
       <w:r>
         <w:rPr>
           <w:rtl/>
@@ -1919,20 +1613,14 @@
         </w:rPr>
         <w:t xml:space="preserve">; </w:t>
       </w:r>
-      <w:hyperlink r:id="rId56">
-        <w:r>
-          <w:rPr>
-            <w:rtl/>
-            <w:cs/>
-            <w:lang w:val="ar_AE" w:bidi="ar_AE"/>
-          </w:rPr>
-          <w:rPr>
-            <w:color w:val="0000EE"/>
-            <w:u w:val="single"/>
-          </w:rPr>
-          <w:t>21:9–16</w:t>
-        </w:r>
-      </w:hyperlink>
+      <w:r>
+        <w:rPr>
+          <w:rtl/>
+          <w:cs/>
+          <w:lang w:val="ar_AE" w:bidi="ar_AE"/>
+        </w:rPr>
+        <w:t>21:9–16</w:t>
+      </w:r>
       <w:r>
         <w:rPr>
           <w:rtl/>
@@ -1941,20 +1629,14 @@
         </w:rPr>
         <w:t xml:space="preserve">; </w:t>
       </w:r>
-      <w:hyperlink r:id="rId44">
-        <w:r>
-          <w:rPr>
-            <w:rtl/>
-            <w:cs/>
-            <w:lang w:val="ar_AE" w:bidi="ar_AE"/>
-          </w:rPr>
-          <w:rPr>
-            <w:color w:val="0000EE"/>
-            <w:u w:val="single"/>
-          </w:rPr>
-          <w:t>23:26–27</w:t>
-        </w:r>
-      </w:hyperlink>
+      <w:r>
+        <w:rPr>
+          <w:rtl/>
+          <w:cs/>
+          <w:lang w:val="ar_AE" w:bidi="ar_AE"/>
+        </w:rPr>
+        <w:t>23:26–27</w:t>
+      </w:r>
       <w:r>
         <w:rPr>
           <w:rtl/>
@@ -1963,20 +1645,14 @@
         </w:rPr>
         <w:t xml:space="preserve">; </w:t>
       </w:r>
-      <w:hyperlink r:id="rId57">
-        <w:r>
-          <w:rPr>
-            <w:rtl/>
-            <w:cs/>
-            <w:lang w:val="ar_AE" w:bidi="ar_AE"/>
-          </w:rPr>
-          <w:rPr>
-            <w:color w:val="0000EE"/>
-            <w:u w:val="single"/>
-          </w:rPr>
-          <w:t>24:20–25:21</w:t>
-        </w:r>
-      </w:hyperlink>
+      <w:r>
+        <w:rPr>
+          <w:rtl/>
+          <w:cs/>
+          <w:lang w:val="ar_AE" w:bidi="ar_AE"/>
+        </w:rPr>
+        <w:t>24:20–25:21</w:t>
+      </w:r>
       <w:r>
         <w:rPr>
           <w:rtl/>
@@ -1985,20 +1661,14 @@
         </w:rPr>
         <w:t xml:space="preserve">; </w:t>
       </w:r>
-      <w:hyperlink r:id="rId58">
-        <w:r>
-          <w:rPr>
-            <w:rtl/>
-            <w:cs/>
-            <w:lang w:val="ar_AE" w:bidi="ar_AE"/>
-          </w:rPr>
-          <w:rPr>
-            <w:color w:val="0000EE"/>
-            <w:u w:val="single"/>
-          </w:rPr>
-          <w:t>مزمور 62:12</w:t>
-        </w:r>
-      </w:hyperlink>
+      <w:r>
+        <w:rPr>
+          <w:rtl/>
+          <w:cs/>
+          <w:lang w:val="ar_AE" w:bidi="ar_AE"/>
+        </w:rPr>
+        <w:t>مزمور 62:12</w:t>
+      </w:r>
       <w:r>
         <w:rPr>
           <w:rtl/>
@@ -2007,20 +1677,14 @@
         </w:rPr>
         <w:t xml:space="preserve">; </w:t>
       </w:r>
-      <w:hyperlink r:id="rId59">
-        <w:r>
-          <w:rPr>
-            <w:rtl/>
-            <w:cs/>
-            <w:lang w:val="ar_AE" w:bidi="ar_AE"/>
-          </w:rPr>
-          <w:rPr>
-            <w:color w:val="0000EE"/>
-            <w:u w:val="single"/>
-          </w:rPr>
-          <w:t>أمثال 11:31</w:t>
-        </w:r>
-      </w:hyperlink>
+      <w:r>
+        <w:rPr>
+          <w:rtl/>
+          <w:cs/>
+          <w:lang w:val="ar_AE" w:bidi="ar_AE"/>
+        </w:rPr>
+        <w:t>أمثال 11:31</w:t>
+      </w:r>
       <w:r>
         <w:rPr>
           <w:rtl/>
@@ -2029,20 +1693,14 @@
         </w:rPr>
         <w:t xml:space="preserve">; </w:t>
       </w:r>
-      <w:hyperlink r:id="rId60">
-        <w:r>
-          <w:rPr>
-            <w:rtl/>
-            <w:cs/>
-            <w:lang w:val="ar_AE" w:bidi="ar_AE"/>
-          </w:rPr>
-          <w:rPr>
-            <w:color w:val="0000EE"/>
-            <w:u w:val="single"/>
-          </w:rPr>
-          <w:t>إشعياء 3:10–11</w:t>
-        </w:r>
-      </w:hyperlink>
+      <w:r>
+        <w:rPr>
+          <w:rtl/>
+          <w:cs/>
+          <w:lang w:val="ar_AE" w:bidi="ar_AE"/>
+        </w:rPr>
+        <w:t>إشعياء 3:10–11</w:t>
+      </w:r>
       <w:r>
         <w:rPr>
           <w:rtl/>
@@ -2051,20 +1709,14 @@
         </w:rPr>
         <w:t xml:space="preserve">; </w:t>
       </w:r>
-      <w:hyperlink r:id="rId61">
-        <w:r>
-          <w:rPr>
-            <w:rtl/>
-            <w:cs/>
-            <w:lang w:val="ar_AE" w:bidi="ar_AE"/>
-          </w:rPr>
-          <w:rPr>
-            <w:color w:val="0000EE"/>
-            <w:u w:val="single"/>
-          </w:rPr>
-          <w:t>إرميا 1:16</w:t>
-        </w:r>
-      </w:hyperlink>
+      <w:r>
+        <w:rPr>
+          <w:rtl/>
+          <w:cs/>
+          <w:lang w:val="ar_AE" w:bidi="ar_AE"/>
+        </w:rPr>
+        <w:t>إرميا 1:16</w:t>
+      </w:r>
       <w:r>
         <w:rPr>
           <w:rtl/>
@@ -2073,20 +1725,14 @@
         </w:rPr>
         <w:t xml:space="preserve">; </w:t>
       </w:r>
-      <w:hyperlink r:id="rId62">
-        <w:r>
-          <w:rPr>
-            <w:rtl/>
-            <w:cs/>
-            <w:lang w:val="ar_AE" w:bidi="ar_AE"/>
-          </w:rPr>
-          <w:rPr>
-            <w:color w:val="0000EE"/>
-            <w:u w:val="single"/>
-          </w:rPr>
-          <w:t>17:10</w:t>
-        </w:r>
-      </w:hyperlink>
+      <w:r>
+        <w:rPr>
+          <w:rtl/>
+          <w:cs/>
+          <w:lang w:val="ar_AE" w:bidi="ar_AE"/>
+        </w:rPr>
+        <w:t>17:10</w:t>
+      </w:r>
       <w:r>
         <w:rPr>
           <w:rtl/>
@@ -2095,20 +1741,14 @@
         </w:rPr>
         <w:t xml:space="preserve">; </w:t>
       </w:r>
-      <w:hyperlink r:id="rId52">
-        <w:r>
-          <w:rPr>
-            <w:rtl/>
-            <w:cs/>
-            <w:lang w:val="ar_AE" w:bidi="ar_AE"/>
-          </w:rPr>
-          <w:rPr>
-            <w:color w:val="0000EE"/>
-            <w:u w:val="single"/>
-          </w:rPr>
-          <w:t>23:3–6</w:t>
-        </w:r>
-      </w:hyperlink>
+      <w:r>
+        <w:rPr>
+          <w:rtl/>
+          <w:cs/>
+          <w:lang w:val="ar_AE" w:bidi="ar_AE"/>
+        </w:rPr>
+        <w:t>23:3–6</w:t>
+      </w:r>
       <w:r>
         <w:rPr>
           <w:rtl/>
@@ -2117,20 +1757,14 @@
         </w:rPr>
         <w:t xml:space="preserve">; </w:t>
       </w:r>
-      <w:hyperlink r:id="rId63">
-        <w:r>
-          <w:rPr>
-            <w:rtl/>
-            <w:cs/>
-            <w:lang w:val="ar_AE" w:bidi="ar_AE"/>
-          </w:rPr>
-          <w:rPr>
-            <w:color w:val="0000EE"/>
-            <w:u w:val="single"/>
-          </w:rPr>
-          <w:t>حزقيال 7:1–9</w:t>
-        </w:r>
-      </w:hyperlink>
+      <w:r>
+        <w:rPr>
+          <w:rtl/>
+          <w:cs/>
+          <w:lang w:val="ar_AE" w:bidi="ar_AE"/>
+        </w:rPr>
+        <w:t>حزقيال 7:1–9</w:t>
+      </w:r>
       <w:r>
         <w:rPr>
           <w:rtl/>
@@ -2139,20 +1773,14 @@
         </w:rPr>
         <w:t xml:space="preserve">; </w:t>
       </w:r>
-      <w:hyperlink r:id="rId64">
-        <w:r>
-          <w:rPr>
-            <w:rtl/>
-            <w:cs/>
-            <w:lang w:val="ar_AE" w:bidi="ar_AE"/>
-          </w:rPr>
-          <w:rPr>
-            <w:color w:val="0000EE"/>
-            <w:u w:val="single"/>
-          </w:rPr>
-          <w:t>33:18–20</w:t>
-        </w:r>
-      </w:hyperlink>
+      <w:r>
+        <w:rPr>
+          <w:rtl/>
+          <w:cs/>
+          <w:lang w:val="ar_AE" w:bidi="ar_AE"/>
+        </w:rPr>
+        <w:t>33:18–20</w:t>
+      </w:r>
       <w:r>
         <w:rPr>
           <w:rtl/>
@@ -2161,20 +1789,14 @@
         </w:rPr>
         <w:t xml:space="preserve">; </w:t>
       </w:r>
-      <w:hyperlink r:id="rId65">
-        <w:r>
-          <w:rPr>
-            <w:rtl/>
-            <w:cs/>
-            <w:lang w:val="ar_AE" w:bidi="ar_AE"/>
-          </w:rPr>
-          <w:rPr>
-            <w:color w:val="0000EE"/>
-            <w:u w:val="single"/>
-          </w:rPr>
-          <w:t>34:17–24</w:t>
-        </w:r>
-      </w:hyperlink>
+      <w:r>
+        <w:rPr>
+          <w:rtl/>
+          <w:cs/>
+          <w:lang w:val="ar_AE" w:bidi="ar_AE"/>
+        </w:rPr>
+        <w:t>34:17–24</w:t>
+      </w:r>
       <w:r>
         <w:rPr>
           <w:rtl/>
@@ -2183,20 +1805,14 @@
         </w:rPr>
         <w:t xml:space="preserve">; </w:t>
       </w:r>
-      <w:hyperlink r:id="rId66">
-        <w:r>
-          <w:rPr>
-            <w:rtl/>
-            <w:cs/>
-            <w:lang w:val="ar_AE" w:bidi="ar_AE"/>
-          </w:rPr>
-          <w:rPr>
-            <w:color w:val="0000EE"/>
-            <w:u w:val="single"/>
-          </w:rPr>
-          <w:t>39:23–24</w:t>
-        </w:r>
-      </w:hyperlink>
+      <w:r>
+        <w:rPr>
+          <w:rtl/>
+          <w:cs/>
+          <w:lang w:val="ar_AE" w:bidi="ar_AE"/>
+        </w:rPr>
+        <w:t>39:23–24</w:t>
+      </w:r>
       <w:r>
         <w:rPr>
           <w:rtl/>
@@ -2205,20 +1821,14 @@
         </w:rPr>
         <w:t xml:space="preserve">; </w:t>
       </w:r>
-      <w:hyperlink r:id="rId48">
-        <w:r>
-          <w:rPr>
-            <w:rtl/>
-            <w:cs/>
-            <w:lang w:val="ar_AE" w:bidi="ar_AE"/>
-          </w:rPr>
-          <w:rPr>
-            <w:color w:val="0000EE"/>
-            <w:u w:val="single"/>
-          </w:rPr>
-          <w:t>هوشع 11:1–11</w:t>
-        </w:r>
-      </w:hyperlink>
+      <w:r>
+        <w:rPr>
+          <w:rtl/>
+          <w:cs/>
+          <w:lang w:val="ar_AE" w:bidi="ar_AE"/>
+        </w:rPr>
+        <w:t>هوشع 11:1–11</w:t>
+      </w:r>
       <w:r>
         <w:rPr>
           <w:rtl/>
@@ -2227,20 +1837,14 @@
         </w:rPr>
         <w:t xml:space="preserve">; </w:t>
       </w:r>
-      <w:hyperlink r:id="rId67">
-        <w:r>
-          <w:rPr>
-            <w:rtl/>
-            <w:cs/>
-            <w:lang w:val="ar_AE" w:bidi="ar_AE"/>
-          </w:rPr>
-          <w:rPr>
-            <w:color w:val="0000EE"/>
-            <w:u w:val="single"/>
-          </w:rPr>
-          <w:t>عاموس 3:2</w:t>
-        </w:r>
-      </w:hyperlink>
+      <w:r>
+        <w:rPr>
+          <w:rtl/>
+          <w:cs/>
+          <w:lang w:val="ar_AE" w:bidi="ar_AE"/>
+        </w:rPr>
+        <w:t>عاموس 3:2</w:t>
+      </w:r>
       <w:r>
         <w:rPr>
           <w:rtl/>
@@ -2249,20 +1853,14 @@
         </w:rPr>
         <w:t xml:space="preserve">; </w:t>
       </w:r>
-      <w:hyperlink r:id="rId68">
-        <w:r>
-          <w:rPr>
-            <w:rtl/>
-            <w:cs/>
-            <w:lang w:val="ar_AE" w:bidi="ar_AE"/>
-          </w:rPr>
-          <w:rPr>
-            <w:color w:val="0000EE"/>
-            <w:u w:val="single"/>
-          </w:rPr>
-          <w:t>متى 25:24–30</w:t>
-        </w:r>
-      </w:hyperlink>
+      <w:r>
+        <w:rPr>
+          <w:rtl/>
+          <w:cs/>
+          <w:lang w:val="ar_AE" w:bidi="ar_AE"/>
+        </w:rPr>
+        <w:t>متى 25:24–30</w:t>
+      </w:r>
       <w:r>
         <w:rPr>
           <w:rtl/>
@@ -2271,20 +1869,14 @@
         </w:rPr>
         <w:t xml:space="preserve">; </w:t>
       </w:r>
-      <w:hyperlink r:id="rId69">
-        <w:r>
-          <w:rPr>
-            <w:rtl/>
-            <w:cs/>
-            <w:lang w:val="ar_AE" w:bidi="ar_AE"/>
-          </w:rPr>
-          <w:rPr>
-            <w:color w:val="0000EE"/>
-            <w:u w:val="single"/>
-          </w:rPr>
-          <w:t>لوقا 12:47–48</w:t>
-        </w:r>
-      </w:hyperlink>
+      <w:r>
+        <w:rPr>
+          <w:rtl/>
+          <w:cs/>
+          <w:lang w:val="ar_AE" w:bidi="ar_AE"/>
+        </w:rPr>
+        <w:t>لوقا 12:47–48</w:t>
+      </w:r>
       <w:r>
         <w:rPr>
           <w:rtl/>
@@ -2293,20 +1885,14 @@
         </w:rPr>
         <w:t xml:space="preserve">; </w:t>
       </w:r>
-      <w:hyperlink r:id="rId70">
-        <w:r>
-          <w:rPr>
-            <w:rtl/>
-            <w:cs/>
-            <w:lang w:val="ar_AE" w:bidi="ar_AE"/>
-          </w:rPr>
-          <w:rPr>
-            <w:color w:val="0000EE"/>
-            <w:u w:val="single"/>
-          </w:rPr>
-          <w:t>13:6–9</w:t>
-        </w:r>
-      </w:hyperlink>
+      <w:r>
+        <w:rPr>
+          <w:rtl/>
+          <w:cs/>
+          <w:lang w:val="ar_AE" w:bidi="ar_AE"/>
+        </w:rPr>
+        <w:t>13:6–9</w:t>
+      </w:r>
       <w:r>
         <w:rPr>
           <w:rtl/>
@@ -2315,20 +1901,14 @@
         </w:rPr>
         <w:t xml:space="preserve">; </w:t>
       </w:r>
-      <w:hyperlink r:id="rId71">
-        <w:r>
-          <w:rPr>
-            <w:rtl/>
-            <w:cs/>
-            <w:lang w:val="ar_AE" w:bidi="ar_AE"/>
-          </w:rPr>
-          <w:rPr>
-            <w:color w:val="0000EE"/>
-            <w:u w:val="single"/>
-          </w:rPr>
-          <w:t>يوحنا 5:45–47</w:t>
-        </w:r>
-      </w:hyperlink>
+      <w:r>
+        <w:rPr>
+          <w:rtl/>
+          <w:cs/>
+          <w:lang w:val="ar_AE" w:bidi="ar_AE"/>
+        </w:rPr>
+        <w:t>يوحنا 5:45–47</w:t>
+      </w:r>
       <w:r>
         <w:rPr>
           <w:rtl/>
@@ -2337,20 +1917,14 @@
         </w:rPr>
         <w:t xml:space="preserve">; </w:t>
       </w:r>
-      <w:hyperlink r:id="rId54">
-        <w:r>
-          <w:rPr>
-            <w:rtl/>
-            <w:cs/>
-            <w:lang w:val="ar_AE" w:bidi="ar_AE"/>
-          </w:rPr>
-          <w:rPr>
-            <w:color w:val="0000EE"/>
-            <w:u w:val="single"/>
-          </w:rPr>
-          <w:t>رومية 11:5–36</w:t>
-        </w:r>
-      </w:hyperlink>
+      <w:r>
+        <w:rPr>
+          <w:rtl/>
+          <w:cs/>
+          <w:lang w:val="ar_AE" w:bidi="ar_AE"/>
+        </w:rPr>
+        <w:t>رومية 11:5–36</w:t>
+      </w:r>
       <w:r>
         <w:rPr>
           <w:rtl/>
@@ -2359,20 +1933,14 @@
         </w:rPr>
         <w:t xml:space="preserve">; </w:t>
       </w:r>
-      <w:hyperlink r:id="rId72">
-        <w:r>
-          <w:rPr>
-            <w:rtl/>
-            <w:cs/>
-            <w:lang w:val="ar_AE" w:bidi="ar_AE"/>
-          </w:rPr>
-          <w:rPr>
-            <w:color w:val="0000EE"/>
-            <w:u w:val="single"/>
-          </w:rPr>
-          <w:t>كولوسي 3:23–25</w:t>
-        </w:r>
-      </w:hyperlink>
+      <w:r>
+        <w:rPr>
+          <w:rtl/>
+          <w:cs/>
+          <w:lang w:val="ar_AE" w:bidi="ar_AE"/>
+        </w:rPr>
+        <w:t>كولوسي 3:23–25</w:t>
+      </w:r>
       <w:r>
         <w:rPr>
           <w:rtl/>
@@ -2381,20 +1949,14 @@
         </w:rPr>
         <w:t xml:space="preserve">; </w:t>
       </w:r>
-      <w:hyperlink r:id="rId73">
-        <w:r>
-          <w:rPr>
-            <w:rtl/>
-            <w:cs/>
-            <w:lang w:val="ar_AE" w:bidi="ar_AE"/>
-          </w:rPr>
-          <w:rPr>
-            <w:color w:val="0000EE"/>
-            <w:u w:val="single"/>
-          </w:rPr>
-          <w:t>عبرانيين 12:25</w:t>
-        </w:r>
-      </w:hyperlink>
+      <w:r>
+        <w:rPr>
+          <w:rtl/>
+          <w:cs/>
+          <w:lang w:val="ar_AE" w:bidi="ar_AE"/>
+        </w:rPr>
+        <w:t>عبرانيين 12:25</w:t>
+      </w:r>
       <w:r>
         <w:rPr>
           <w:rtl/>
@@ -2403,20 +1965,14 @@
         </w:rPr>
         <w:t xml:space="preserve">; </w:t>
       </w:r>
-      <w:hyperlink r:id="rId74">
-        <w:r>
-          <w:rPr>
-            <w:rtl/>
-            <w:cs/>
-            <w:lang w:val="ar_AE" w:bidi="ar_AE"/>
-          </w:rPr>
-          <w:rPr>
-            <w:color w:val="0000EE"/>
-            <w:u w:val="single"/>
-          </w:rPr>
-          <w:t>يعقوب 2:12–13</w:t>
-        </w:r>
-      </w:hyperlink>
+      <w:r>
+        <w:rPr>
+          <w:rtl/>
+          <w:cs/>
+          <w:lang w:val="ar_AE" w:bidi="ar_AE"/>
+        </w:rPr>
+        <w:t>يعقوب 2:12–13</w:t>
+      </w:r>
       <w:r>
         <w:rPr>
           <w:rtl/>
@@ -2425,20 +1981,14 @@
         </w:rPr>
         <w:t xml:space="preserve">; </w:t>
       </w:r>
-      <w:hyperlink r:id="rId75">
-        <w:r>
-          <w:rPr>
-            <w:rtl/>
-            <w:cs/>
-            <w:lang w:val="ar_AE" w:bidi="ar_AE"/>
-          </w:rPr>
-          <w:rPr>
-            <w:color w:val="0000EE"/>
-            <w:u w:val="single"/>
-          </w:rPr>
-          <w:t>1 بطرس 1:17</w:t>
-        </w:r>
-      </w:hyperlink>
+      <w:r>
+        <w:rPr>
+          <w:rtl/>
+          <w:cs/>
+          <w:lang w:val="ar_AE" w:bidi="ar_AE"/>
+        </w:rPr>
+        <w:t>1 بطرس 1:17</w:t>
+      </w:r>
       <w:r>
         <w:rPr>
           <w:rtl/>
@@ -2447,20 +1997,14 @@
         </w:rPr>
         <w:t xml:space="preserve">; </w:t>
       </w:r>
-      <w:hyperlink r:id="rId76">
-        <w:r>
-          <w:rPr>
-            <w:rtl/>
-            <w:cs/>
-            <w:lang w:val="ar_AE" w:bidi="ar_AE"/>
-          </w:rPr>
-          <w:rPr>
-            <w:color w:val="0000EE"/>
-            <w:u w:val="single"/>
-          </w:rPr>
-          <w:t>رؤيا 2:1–3:22</w:t>
-        </w:r>
-      </w:hyperlink>
+      <w:r>
+        <w:rPr>
+          <w:rtl/>
+          <w:cs/>
+          <w:lang w:val="ar_AE" w:bidi="ar_AE"/>
+        </w:rPr>
+        <w:t>رؤيا 2:1–3:22</w:t>
+      </w:r>
       <w:r>
         <w:rPr>
           <w:rtl/>

</xml_diff>